<commit_message>
Add the journal and payment 1500000002 to Requisition to Payment
Goods receipt 5000000004 and invoice 5100000003 are cleared by vendor payment 1500000002 for 221.00 USD.

Co-authored-by: aleo25672 <aleo25672@users.noreply.github.com>
</commit_message>
<xml_diff>
--- a/docs/REQUISITION_TO_PAYMENT.docx
+++ b/docs/REQUISITION_TO_PAYMENT.docx
@@ -676,7 +676,7 @@
                 <w:color w:val="1A1A1A"/>
                 <w:sz w:val="16"/>
               </w:rPr>
-              <w:t>Payment</w:t>
+              <w:t>Payment 1500000002 (type KZ)</w:t>
             </w:r>
           </w:p>
         </w:tc>
@@ -703,7 +703,7 @@
                 <w:color w:val="1A1A1A"/>
                 <w:sz w:val="16"/>
               </w:rPr>
-              <w:t>Not in this extract. There is no universal-journal file.</w:t>
+              <w:t>221.00 USD on 20261013. Clears the vendor line of journal 5100000003.</w:t>
             </w:r>
           </w:p>
         </w:tc>
@@ -4017,7 +4017,7 @@
           <w:color w:val="1A1A1A"/>
           <w:sz w:val="22"/>
         </w:rPr>
-        <w:t>Supplier invoice 5100001601, party reference SUPP.INV.0004, posting date 20261012, invoicing party 0001000579, status 5. Header gross 221.00 USD. The two item amounts are 98.00 and 121.00, together 219.00.</w:t>
+        <w:t>Supplier invoice 5100001601, party reference SUPP.INV.0004, posting date 20261012, invoicing party 0001000579, status 5. Header gross 221.00 USD. The two item amounts are 98.00 and 121.00. The journal adds a 2.00 debit, so the header gross is 221.00.</w:t>
       </w:r>
     </w:p>
     <w:tbl>
@@ -4481,7 +4481,7 @@
           <w:color w:val="1A1A1A"/>
           <w:sz w:val="22"/>
         </w:rPr>
-        <w:t>Account assignment category K. Both purchase-order items are assigned to cost center 0017100100, profit center YB600, and G/L 0054400000 (external 54400000, group ERG., profit-and-loss account). This extract set has no universal-journal file, so the accounting document for the invoice is not in the sample.</w:t>
+        <w:t>Account assignment category K. Both purchase-order items are assigned to cost center 0017100100, profit center YB600, and G/L 0052060000 (external 52060000, group ERG., profit-and-loss account). Ledger 0L. Goods receipt 5000002952 posts to accounting document 5000000004. Supplier invoice 5100001601 posts to accounting document 5100000003.</w:t>
       </w:r>
     </w:p>
     <w:tbl>
@@ -4493,12 +4493,15 @@
         <w:tblLook w:firstColumn="1" w:firstRow="1" w:lastColumn="0" w:lastRow="0" w:noHBand="0" w:noVBand="1" w:val="04A0"/>
       </w:tblPr>
       <w:tblGrid>
-        <w:gridCol w:w="1738"/>
-        <w:gridCol w:w="1738"/>
-        <w:gridCol w:w="1738"/>
-        <w:gridCol w:w="1738"/>
-        <w:gridCol w:w="1738"/>
-        <w:gridCol w:w="1738"/>
+        <w:gridCol w:w="1158"/>
+        <w:gridCol w:w="1158"/>
+        <w:gridCol w:w="1158"/>
+        <w:gridCol w:w="1158"/>
+        <w:gridCol w:w="1158"/>
+        <w:gridCol w:w="1158"/>
+        <w:gridCol w:w="1158"/>
+        <w:gridCol w:w="1158"/>
+        <w:gridCol w:w="1158"/>
       </w:tblGrid>
       <w:tr>
         <w:trPr>
@@ -4507,7 +4510,7 @@
         </w:trPr>
         <w:tc>
           <w:tcPr>
-            <w:tcW w:type="dxa" w:w="1738"/>
+            <w:tcW w:type="dxa" w:w="1158"/>
             <w:shd w:val="clear" w:color="auto" w:fill="1F4E79"/>
             <w:tcMar>
               <w:top w:w="60" w:type="dxa"/>
@@ -4526,15 +4529,15 @@
                 <w:rFonts w:ascii="Calibri" w:hAnsi="Calibri" w:eastAsia="Calibri"/>
                 <w:b/>
                 <w:color w:val="FFFFFF"/>
-                <w:sz w:val="16"/>
-              </w:rPr>
-              <w:t>PO item</w:t>
-            </w:r>
-          </w:p>
-        </w:tc>
-        <w:tc>
-          <w:tcPr>
-            <w:tcW w:type="dxa" w:w="1738"/>
+                <w:sz w:val="14"/>
+              </w:rPr>
+              <w:t>FI document</w:t>
+            </w:r>
+          </w:p>
+        </w:tc>
+        <w:tc>
+          <w:tcPr>
+            <w:tcW w:type="dxa" w:w="1158"/>
             <w:shd w:val="clear" w:color="auto" w:fill="1F4E79"/>
             <w:tcMar>
               <w:top w:w="60" w:type="dxa"/>
@@ -4553,15 +4556,15 @@
                 <w:rFonts w:ascii="Calibri" w:hAnsi="Calibri" w:eastAsia="Calibri"/>
                 <w:b/>
                 <w:color w:val="FFFFFF"/>
-                <w:sz w:val="16"/>
-              </w:rPr>
-              <w:t>Assignment</w:t>
-            </w:r>
-          </w:p>
-        </w:tc>
-        <w:tc>
-          <w:tcPr>
-            <w:tcW w:type="dxa" w:w="1738"/>
+                <w:sz w:val="14"/>
+              </w:rPr>
+              <w:t>Type</w:t>
+            </w:r>
+          </w:p>
+        </w:tc>
+        <w:tc>
+          <w:tcPr>
+            <w:tcW w:type="dxa" w:w="1158"/>
             <w:shd w:val="clear" w:color="auto" w:fill="1F4E79"/>
             <w:tcMar>
               <w:top w:w="60" w:type="dxa"/>
@@ -4580,15 +4583,15 @@
                 <w:rFonts w:ascii="Calibri" w:hAnsi="Calibri" w:eastAsia="Calibri"/>
                 <w:b/>
                 <w:color w:val="FFFFFF"/>
-                <w:sz w:val="16"/>
-              </w:rPr>
-              <w:t>Cost center</w:t>
-            </w:r>
-          </w:p>
-        </w:tc>
-        <w:tc>
-          <w:tcPr>
-            <w:tcW w:type="dxa" w:w="1738"/>
+                <w:sz w:val="14"/>
+              </w:rPr>
+              <w:t>Line</w:t>
+            </w:r>
+          </w:p>
+        </w:tc>
+        <w:tc>
+          <w:tcPr>
+            <w:tcW w:type="dxa" w:w="1158"/>
             <w:shd w:val="clear" w:color="auto" w:fill="1F4E79"/>
             <w:tcMar>
               <w:top w:w="60" w:type="dxa"/>
@@ -4607,15 +4610,15 @@
                 <w:rFonts w:ascii="Calibri" w:hAnsi="Calibri" w:eastAsia="Calibri"/>
                 <w:b/>
                 <w:color w:val="FFFFFF"/>
-                <w:sz w:val="16"/>
-              </w:rPr>
-              <w:t>G/L account</w:t>
-            </w:r>
-          </w:p>
-        </w:tc>
-        <w:tc>
-          <w:tcPr>
-            <w:tcW w:type="dxa" w:w="1738"/>
+                <w:sz w:val="14"/>
+              </w:rPr>
+              <w:t>G/L</w:t>
+            </w:r>
+          </w:p>
+        </w:tc>
+        <w:tc>
+          <w:tcPr>
+            <w:tcW w:type="dxa" w:w="1158"/>
             <w:shd w:val="clear" w:color="auto" w:fill="1F4E79"/>
             <w:tcMar>
               <w:top w:w="60" w:type="dxa"/>
@@ -4634,15 +4637,15 @@
                 <w:rFonts w:ascii="Calibri" w:hAnsi="Calibri" w:eastAsia="Calibri"/>
                 <w:b/>
                 <w:color w:val="FFFFFF"/>
-                <w:sz w:val="16"/>
-              </w:rPr>
-              <w:t>Quantity</w:t>
-            </w:r>
-          </w:p>
-        </w:tc>
-        <w:tc>
-          <w:tcPr>
-            <w:tcW w:type="dxa" w:w="1738"/>
+                <w:sz w:val="14"/>
+              </w:rPr>
+              <w:t>D/C</w:t>
+            </w:r>
+          </w:p>
+        </w:tc>
+        <w:tc>
+          <w:tcPr>
+            <w:tcW w:type="dxa" w:w="1158"/>
             <w:shd w:val="clear" w:color="auto" w:fill="1F4E79"/>
             <w:tcMar>
               <w:top w:w="60" w:type="dxa"/>
@@ -4661,9 +4664,90 @@
                 <w:rFonts w:ascii="Calibri" w:hAnsi="Calibri" w:eastAsia="Calibri"/>
                 <w:b/>
                 <w:color w:val="FFFFFF"/>
-                <w:sz w:val="16"/>
-              </w:rPr>
-              <w:t>Profit center</w:t>
+                <w:sz w:val="14"/>
+              </w:rPr>
+              <w:t>Amount</w:t>
+            </w:r>
+          </w:p>
+        </w:tc>
+        <w:tc>
+          <w:tcPr>
+            <w:tcW w:type="dxa" w:w="1158"/>
+            <w:shd w:val="clear" w:color="auto" w:fill="1F4E79"/>
+            <w:tcMar>
+              <w:top w:w="60" w:type="dxa"/>
+              <w:left w:w="60" w:type="dxa"/>
+              <w:bottom w:w="60" w:type="dxa"/>
+              <w:right w:w="60" w:type="dxa"/>
+            </w:tcMar>
+          </w:tcPr>
+          <w:p>
+            <w:pPr>
+              <w:spacing w:before="20" w:after="20"/>
+            </w:pPr>
+            <w:r/>
+            <w:r>
+              <w:rPr>
+                <w:rFonts w:ascii="Calibri" w:hAnsi="Calibri" w:eastAsia="Calibri"/>
+                <w:b/>
+                <w:color w:val="FFFFFF"/>
+                <w:sz w:val="14"/>
+              </w:rPr>
+              <w:t>PO item</w:t>
+            </w:r>
+          </w:p>
+        </w:tc>
+        <w:tc>
+          <w:tcPr>
+            <w:tcW w:type="dxa" w:w="1158"/>
+            <w:shd w:val="clear" w:color="auto" w:fill="1F4E79"/>
+            <w:tcMar>
+              <w:top w:w="60" w:type="dxa"/>
+              <w:left w:w="60" w:type="dxa"/>
+              <w:bottom w:w="60" w:type="dxa"/>
+              <w:right w:w="60" w:type="dxa"/>
+            </w:tcMar>
+          </w:tcPr>
+          <w:p>
+            <w:pPr>
+              <w:spacing w:before="20" w:after="20"/>
+            </w:pPr>
+            <w:r/>
+            <w:r>
+              <w:rPr>
+                <w:rFonts w:ascii="Calibri" w:hAnsi="Calibri" w:eastAsia="Calibri"/>
+                <w:b/>
+                <w:color w:val="FFFFFF"/>
+                <w:sz w:val="14"/>
+              </w:rPr>
+              <w:t>Reference</w:t>
+            </w:r>
+          </w:p>
+        </w:tc>
+        <w:tc>
+          <w:tcPr>
+            <w:tcW w:type="dxa" w:w="1158"/>
+            <w:shd w:val="clear" w:color="auto" w:fill="1F4E79"/>
+            <w:tcMar>
+              <w:top w:w="60" w:type="dxa"/>
+              <w:left w:w="60" w:type="dxa"/>
+              <w:bottom w:w="60" w:type="dxa"/>
+              <w:right w:w="60" w:type="dxa"/>
+            </w:tcMar>
+          </w:tcPr>
+          <w:p>
+            <w:pPr>
+              <w:spacing w:before="20" w:after="20"/>
+            </w:pPr>
+            <w:r/>
+            <w:r>
+              <w:rPr>
+                <w:rFonts w:ascii="Calibri" w:hAnsi="Calibri" w:eastAsia="Calibri"/>
+                <w:b/>
+                <w:color w:val="FFFFFF"/>
+                <w:sz w:val="14"/>
+              </w:rPr>
+              <w:t>Clearing doc</w:t>
             </w:r>
           </w:p>
         </w:tc>
@@ -4674,7 +4758,7 @@
         </w:trPr>
         <w:tc>
           <w:tcPr>
-            <w:tcW w:type="dxa" w:w="1738"/>
+            <w:tcW w:type="dxa" w:w="1158"/>
             <w:shd w:val="clear" w:color="auto" w:fill="FFFFFF"/>
             <w:tcMar>
               <w:top w:w="60" w:type="dxa"/>
@@ -4693,15 +4777,15 @@
                 <w:rFonts w:ascii="Calibri" w:hAnsi="Calibri" w:eastAsia="Calibri"/>
                 <w:b w:val="0"/>
                 <w:color w:val="1A1A1A"/>
-                <w:sz w:val="16"/>
-              </w:rPr>
-              <w:t>00010</w:t>
-            </w:r>
-          </w:p>
-        </w:tc>
-        <w:tc>
-          <w:tcPr>
-            <w:tcW w:type="dxa" w:w="1738"/>
+                <w:sz w:val="14"/>
+              </w:rPr>
+              <w:t>5000000004</w:t>
+            </w:r>
+          </w:p>
+        </w:tc>
+        <w:tc>
+          <w:tcPr>
+            <w:tcW w:type="dxa" w:w="1158"/>
             <w:shd w:val="clear" w:color="auto" w:fill="FFFFFF"/>
             <w:tcMar>
               <w:top w:w="60" w:type="dxa"/>
@@ -4720,15 +4804,15 @@
                 <w:rFonts w:ascii="Calibri" w:hAnsi="Calibri" w:eastAsia="Calibri"/>
                 <w:b w:val="0"/>
                 <w:color w:val="1A1A1A"/>
-                <w:sz w:val="16"/>
-              </w:rPr>
-              <w:t>01</w:t>
-            </w:r>
-          </w:p>
-        </w:tc>
-        <w:tc>
-          <w:tcPr>
-            <w:tcW w:type="dxa" w:w="1738"/>
+                <w:sz w:val="14"/>
+              </w:rPr>
+              <w:t>WE</w:t>
+            </w:r>
+          </w:p>
+        </w:tc>
+        <w:tc>
+          <w:tcPr>
+            <w:tcW w:type="dxa" w:w="1158"/>
             <w:shd w:val="clear" w:color="auto" w:fill="FFFFFF"/>
             <w:tcMar>
               <w:top w:w="60" w:type="dxa"/>
@@ -4747,15 +4831,15 @@
                 <w:rFonts w:ascii="Calibri" w:hAnsi="Calibri" w:eastAsia="Calibri"/>
                 <w:b w:val="0"/>
                 <w:color w:val="1A1A1A"/>
-                <w:sz w:val="16"/>
-              </w:rPr>
-              <w:t>0017100100</w:t>
-            </w:r>
-          </w:p>
-        </w:tc>
-        <w:tc>
-          <w:tcPr>
-            <w:tcW w:type="dxa" w:w="1738"/>
+                <w:sz w:val="14"/>
+              </w:rPr>
+              <w:t>000001</w:t>
+            </w:r>
+          </w:p>
+        </w:tc>
+        <w:tc>
+          <w:tcPr>
+            <w:tcW w:type="dxa" w:w="1158"/>
             <w:shd w:val="clear" w:color="auto" w:fill="FFFFFF"/>
             <w:tcMar>
               <w:top w:w="60" w:type="dxa"/>
@@ -4774,7 +4858,7 @@
                 <w:rFonts w:ascii="Calibri" w:hAnsi="Calibri" w:eastAsia="Calibri"/>
                 <w:b w:val="0"/>
                 <w:color w:val="1A1A1A"/>
-                <w:sz w:val="16"/>
+                <w:sz w:val="14"/>
               </w:rPr>
               <w:t>0054400000</w:t>
             </w:r>
@@ -4782,7 +4866,7 @@
         </w:tc>
         <w:tc>
           <w:tcPr>
-            <w:tcW w:type="dxa" w:w="1738"/>
+            <w:tcW w:type="dxa" w:w="1158"/>
             <w:shd w:val="clear" w:color="auto" w:fill="FFFFFF"/>
             <w:tcMar>
               <w:top w:w="60" w:type="dxa"/>
@@ -4801,15 +4885,15 @@
                 <w:rFonts w:ascii="Calibri" w:hAnsi="Calibri" w:eastAsia="Calibri"/>
                 <w:b w:val="0"/>
                 <w:color w:val="1A1A1A"/>
-                <w:sz w:val="16"/>
-              </w:rPr>
-              <w:t>20.000</w:t>
-            </w:r>
-          </w:p>
-        </w:tc>
-        <w:tc>
-          <w:tcPr>
-            <w:tcW w:type="dxa" w:w="1738"/>
+                <w:sz w:val="14"/>
+              </w:rPr>
+              <w:t>S</w:t>
+            </w:r>
+          </w:p>
+        </w:tc>
+        <w:tc>
+          <w:tcPr>
+            <w:tcW w:type="dxa" w:w="1158"/>
             <w:shd w:val="clear" w:color="auto" w:fill="FFFFFF"/>
             <w:tcMar>
               <w:top w:w="60" w:type="dxa"/>
@@ -4828,9 +4912,89 @@
                 <w:rFonts w:ascii="Calibri" w:hAnsi="Calibri" w:eastAsia="Calibri"/>
                 <w:b w:val="0"/>
                 <w:color w:val="1A1A1A"/>
-                <w:sz w:val="16"/>
-              </w:rPr>
-              <w:t>YB600</w:t>
+                <w:sz w:val="14"/>
+              </w:rPr>
+              <w:t>98.00</w:t>
+            </w:r>
+          </w:p>
+        </w:tc>
+        <w:tc>
+          <w:tcPr>
+            <w:tcW w:type="dxa" w:w="1158"/>
+            <w:shd w:val="clear" w:color="auto" w:fill="FFFFFF"/>
+            <w:tcMar>
+              <w:top w:w="60" w:type="dxa"/>
+              <w:left w:w="60" w:type="dxa"/>
+              <w:bottom w:w="60" w:type="dxa"/>
+              <w:right w:w="60" w:type="dxa"/>
+            </w:tcMar>
+          </w:tcPr>
+          <w:p>
+            <w:pPr>
+              <w:spacing w:before="20" w:after="20"/>
+            </w:pPr>
+            <w:r/>
+            <w:r>
+              <w:rPr>
+                <w:rFonts w:ascii="Calibri" w:hAnsi="Calibri" w:eastAsia="Calibri"/>
+                <w:b w:val="0"/>
+                <w:color w:val="1A1A1A"/>
+                <w:sz w:val="14"/>
+              </w:rPr>
+              <w:t>00010</w:t>
+            </w:r>
+          </w:p>
+        </w:tc>
+        <w:tc>
+          <w:tcPr>
+            <w:tcW w:type="dxa" w:w="1158"/>
+            <w:shd w:val="clear" w:color="auto" w:fill="FFFFFF"/>
+            <w:tcMar>
+              <w:top w:w="60" w:type="dxa"/>
+              <w:left w:w="60" w:type="dxa"/>
+              <w:bottom w:w="60" w:type="dxa"/>
+              <w:right w:w="60" w:type="dxa"/>
+            </w:tcMar>
+          </w:tcPr>
+          <w:p>
+            <w:pPr>
+              <w:spacing w:before="20" w:after="20"/>
+            </w:pPr>
+            <w:r/>
+            <w:r>
+              <w:rPr>
+                <w:rFonts w:ascii="Calibri" w:hAnsi="Calibri" w:eastAsia="Calibri"/>
+                <w:b w:val="0"/>
+                <w:color w:val="1A1A1A"/>
+                <w:sz w:val="14"/>
+              </w:rPr>
+              <w:t>5000002952</w:t>
+            </w:r>
+          </w:p>
+        </w:tc>
+        <w:tc>
+          <w:tcPr>
+            <w:tcW w:type="dxa" w:w="1158"/>
+            <w:shd w:val="clear" w:color="auto" w:fill="FFFFFF"/>
+            <w:tcMar>
+              <w:top w:w="60" w:type="dxa"/>
+              <w:left w:w="60" w:type="dxa"/>
+              <w:bottom w:w="60" w:type="dxa"/>
+              <w:right w:w="60" w:type="dxa"/>
+            </w:tcMar>
+          </w:tcPr>
+          <w:p>
+            <w:pPr>
+              <w:spacing w:before="20" w:after="20"/>
+            </w:pPr>
+            <w:r/>
+            <w:r>
+              <w:rPr>
+                <w:rFonts w:ascii="Calibri" w:hAnsi="Calibri" w:eastAsia="Calibri"/>
+                <w:b w:val="0"/>
+                <w:color w:val="1A1A1A"/>
+                <w:sz w:val="14"/>
+              </w:rPr>
             </w:r>
           </w:p>
         </w:tc>
@@ -4841,7 +5005,7 @@
         </w:trPr>
         <w:tc>
           <w:tcPr>
-            <w:tcW w:type="dxa" w:w="1738"/>
+            <w:tcW w:type="dxa" w:w="1158"/>
             <w:shd w:val="clear" w:color="auto" w:fill="F3F6F9"/>
             <w:tcMar>
               <w:top w:w="60" w:type="dxa"/>
@@ -4860,15 +5024,15 @@
                 <w:rFonts w:ascii="Calibri" w:hAnsi="Calibri" w:eastAsia="Calibri"/>
                 <w:b w:val="0"/>
                 <w:color w:val="1A1A1A"/>
-                <w:sz w:val="16"/>
-              </w:rPr>
-              <w:t>00020</w:t>
-            </w:r>
-          </w:p>
-        </w:tc>
-        <w:tc>
-          <w:tcPr>
-            <w:tcW w:type="dxa" w:w="1738"/>
+                <w:sz w:val="14"/>
+              </w:rPr>
+              <w:t>5000000004</w:t>
+            </w:r>
+          </w:p>
+        </w:tc>
+        <w:tc>
+          <w:tcPr>
+            <w:tcW w:type="dxa" w:w="1158"/>
             <w:shd w:val="clear" w:color="auto" w:fill="F3F6F9"/>
             <w:tcMar>
               <w:top w:w="60" w:type="dxa"/>
@@ -4887,15 +5051,15 @@
                 <w:rFonts w:ascii="Calibri" w:hAnsi="Calibri" w:eastAsia="Calibri"/>
                 <w:b w:val="0"/>
                 <w:color w:val="1A1A1A"/>
-                <w:sz w:val="16"/>
-              </w:rPr>
-              <w:t>01</w:t>
-            </w:r>
-          </w:p>
-        </w:tc>
-        <w:tc>
-          <w:tcPr>
-            <w:tcW w:type="dxa" w:w="1738"/>
+                <w:sz w:val="14"/>
+              </w:rPr>
+              <w:t>WE</w:t>
+            </w:r>
+          </w:p>
+        </w:tc>
+        <w:tc>
+          <w:tcPr>
+            <w:tcW w:type="dxa" w:w="1158"/>
             <w:shd w:val="clear" w:color="auto" w:fill="F3F6F9"/>
             <w:tcMar>
               <w:top w:w="60" w:type="dxa"/>
@@ -4914,15 +5078,15 @@
                 <w:rFonts w:ascii="Calibri" w:hAnsi="Calibri" w:eastAsia="Calibri"/>
                 <w:b w:val="0"/>
                 <w:color w:val="1A1A1A"/>
-                <w:sz w:val="16"/>
-              </w:rPr>
-              <w:t>0017100100</w:t>
-            </w:r>
-          </w:p>
-        </w:tc>
-        <w:tc>
-          <w:tcPr>
-            <w:tcW w:type="dxa" w:w="1738"/>
+                <w:sz w:val="14"/>
+              </w:rPr>
+              <w:t>000002</w:t>
+            </w:r>
+          </w:p>
+        </w:tc>
+        <w:tc>
+          <w:tcPr>
+            <w:tcW w:type="dxa" w:w="1158"/>
             <w:shd w:val="clear" w:color="auto" w:fill="F3F6F9"/>
             <w:tcMar>
               <w:top w:w="60" w:type="dxa"/>
@@ -4941,15 +5105,15 @@
                 <w:rFonts w:ascii="Calibri" w:hAnsi="Calibri" w:eastAsia="Calibri"/>
                 <w:b w:val="0"/>
                 <w:color w:val="1A1A1A"/>
-                <w:sz w:val="16"/>
-              </w:rPr>
-              <w:t>0054400000</w:t>
-            </w:r>
-          </w:p>
-        </w:tc>
-        <w:tc>
-          <w:tcPr>
-            <w:tcW w:type="dxa" w:w="1738"/>
+                <w:sz w:val="14"/>
+              </w:rPr>
+              <w:t>0021120000</w:t>
+            </w:r>
+          </w:p>
+        </w:tc>
+        <w:tc>
+          <w:tcPr>
+            <w:tcW w:type="dxa" w:w="1158"/>
             <w:shd w:val="clear" w:color="auto" w:fill="F3F6F9"/>
             <w:tcMar>
               <w:top w:w="60" w:type="dxa"/>
@@ -4968,15 +5132,15 @@
                 <w:rFonts w:ascii="Calibri" w:hAnsi="Calibri" w:eastAsia="Calibri"/>
                 <w:b w:val="0"/>
                 <w:color w:val="1A1A1A"/>
-                <w:sz w:val="16"/>
-              </w:rPr>
-              <w:t>5.000</w:t>
-            </w:r>
-          </w:p>
-        </w:tc>
-        <w:tc>
-          <w:tcPr>
-            <w:tcW w:type="dxa" w:w="1738"/>
+                <w:sz w:val="14"/>
+              </w:rPr>
+              <w:t>H</w:t>
+            </w:r>
+          </w:p>
+        </w:tc>
+        <w:tc>
+          <w:tcPr>
+            <w:tcW w:type="dxa" w:w="1158"/>
             <w:shd w:val="clear" w:color="auto" w:fill="F3F6F9"/>
             <w:tcMar>
               <w:top w:w="60" w:type="dxa"/>
@@ -4995,9 +5159,1570 @@
                 <w:rFonts w:ascii="Calibri" w:hAnsi="Calibri" w:eastAsia="Calibri"/>
                 <w:b w:val="0"/>
                 <w:color w:val="1A1A1A"/>
-                <w:sz w:val="16"/>
-              </w:rPr>
-              <w:t>YB600</w:t>
+                <w:sz w:val="14"/>
+              </w:rPr>
+              <w:t>-98.00</w:t>
+            </w:r>
+          </w:p>
+        </w:tc>
+        <w:tc>
+          <w:tcPr>
+            <w:tcW w:type="dxa" w:w="1158"/>
+            <w:shd w:val="clear" w:color="auto" w:fill="F3F6F9"/>
+            <w:tcMar>
+              <w:top w:w="60" w:type="dxa"/>
+              <w:left w:w="60" w:type="dxa"/>
+              <w:bottom w:w="60" w:type="dxa"/>
+              <w:right w:w="60" w:type="dxa"/>
+            </w:tcMar>
+          </w:tcPr>
+          <w:p>
+            <w:pPr>
+              <w:spacing w:before="20" w:after="20"/>
+            </w:pPr>
+            <w:r/>
+            <w:r>
+              <w:rPr>
+                <w:rFonts w:ascii="Calibri" w:hAnsi="Calibri" w:eastAsia="Calibri"/>
+                <w:b w:val="0"/>
+                <w:color w:val="1A1A1A"/>
+                <w:sz w:val="14"/>
+              </w:rPr>
+              <w:t>00010</w:t>
+            </w:r>
+          </w:p>
+        </w:tc>
+        <w:tc>
+          <w:tcPr>
+            <w:tcW w:type="dxa" w:w="1158"/>
+            <w:shd w:val="clear" w:color="auto" w:fill="F3F6F9"/>
+            <w:tcMar>
+              <w:top w:w="60" w:type="dxa"/>
+              <w:left w:w="60" w:type="dxa"/>
+              <w:bottom w:w="60" w:type="dxa"/>
+              <w:right w:w="60" w:type="dxa"/>
+            </w:tcMar>
+          </w:tcPr>
+          <w:p>
+            <w:pPr>
+              <w:spacing w:before="20" w:after="20"/>
+            </w:pPr>
+            <w:r/>
+            <w:r>
+              <w:rPr>
+                <w:rFonts w:ascii="Calibri" w:hAnsi="Calibri" w:eastAsia="Calibri"/>
+                <w:b w:val="0"/>
+                <w:color w:val="1A1A1A"/>
+                <w:sz w:val="14"/>
+              </w:rPr>
+              <w:t>5000002952</w:t>
+            </w:r>
+          </w:p>
+        </w:tc>
+        <w:tc>
+          <w:tcPr>
+            <w:tcW w:type="dxa" w:w="1158"/>
+            <w:shd w:val="clear" w:color="auto" w:fill="F3F6F9"/>
+            <w:tcMar>
+              <w:top w:w="60" w:type="dxa"/>
+              <w:left w:w="60" w:type="dxa"/>
+              <w:bottom w:w="60" w:type="dxa"/>
+              <w:right w:w="60" w:type="dxa"/>
+            </w:tcMar>
+          </w:tcPr>
+          <w:p>
+            <w:pPr>
+              <w:spacing w:before="20" w:after="20"/>
+            </w:pPr>
+            <w:r/>
+            <w:r>
+              <w:rPr>
+                <w:rFonts w:ascii="Calibri" w:hAnsi="Calibri" w:eastAsia="Calibri"/>
+                <w:b w:val="0"/>
+                <w:color w:val="1A1A1A"/>
+                <w:sz w:val="14"/>
+              </w:rPr>
+            </w:r>
+          </w:p>
+        </w:tc>
+      </w:tr>
+      <w:tr>
+        <w:trPr>
+          <w:cantSplit/>
+        </w:trPr>
+        <w:tc>
+          <w:tcPr>
+            <w:tcW w:type="dxa" w:w="1158"/>
+            <w:shd w:val="clear" w:color="auto" w:fill="FFFFFF"/>
+            <w:tcMar>
+              <w:top w:w="60" w:type="dxa"/>
+              <w:left w:w="60" w:type="dxa"/>
+              <w:bottom w:w="60" w:type="dxa"/>
+              <w:right w:w="60" w:type="dxa"/>
+            </w:tcMar>
+          </w:tcPr>
+          <w:p>
+            <w:pPr>
+              <w:spacing w:before="20" w:after="20"/>
+            </w:pPr>
+            <w:r/>
+            <w:r>
+              <w:rPr>
+                <w:rFonts w:ascii="Calibri" w:hAnsi="Calibri" w:eastAsia="Calibri"/>
+                <w:b w:val="0"/>
+                <w:color w:val="1A1A1A"/>
+                <w:sz w:val="14"/>
+              </w:rPr>
+              <w:t>5000000004</w:t>
+            </w:r>
+          </w:p>
+        </w:tc>
+        <w:tc>
+          <w:tcPr>
+            <w:tcW w:type="dxa" w:w="1158"/>
+            <w:shd w:val="clear" w:color="auto" w:fill="FFFFFF"/>
+            <w:tcMar>
+              <w:top w:w="60" w:type="dxa"/>
+              <w:left w:w="60" w:type="dxa"/>
+              <w:bottom w:w="60" w:type="dxa"/>
+              <w:right w:w="60" w:type="dxa"/>
+            </w:tcMar>
+          </w:tcPr>
+          <w:p>
+            <w:pPr>
+              <w:spacing w:before="20" w:after="20"/>
+            </w:pPr>
+            <w:r/>
+            <w:r>
+              <w:rPr>
+                <w:rFonts w:ascii="Calibri" w:hAnsi="Calibri" w:eastAsia="Calibri"/>
+                <w:b w:val="0"/>
+                <w:color w:val="1A1A1A"/>
+                <w:sz w:val="14"/>
+              </w:rPr>
+              <w:t>WE</w:t>
+            </w:r>
+          </w:p>
+        </w:tc>
+        <w:tc>
+          <w:tcPr>
+            <w:tcW w:type="dxa" w:w="1158"/>
+            <w:shd w:val="clear" w:color="auto" w:fill="FFFFFF"/>
+            <w:tcMar>
+              <w:top w:w="60" w:type="dxa"/>
+              <w:left w:w="60" w:type="dxa"/>
+              <w:bottom w:w="60" w:type="dxa"/>
+              <w:right w:w="60" w:type="dxa"/>
+            </w:tcMar>
+          </w:tcPr>
+          <w:p>
+            <w:pPr>
+              <w:spacing w:before="20" w:after="20"/>
+            </w:pPr>
+            <w:r/>
+            <w:r>
+              <w:rPr>
+                <w:rFonts w:ascii="Calibri" w:hAnsi="Calibri" w:eastAsia="Calibri"/>
+                <w:b w:val="0"/>
+                <w:color w:val="1A1A1A"/>
+                <w:sz w:val="14"/>
+              </w:rPr>
+              <w:t>000003</w:t>
+            </w:r>
+          </w:p>
+        </w:tc>
+        <w:tc>
+          <w:tcPr>
+            <w:tcW w:type="dxa" w:w="1158"/>
+            <w:shd w:val="clear" w:color="auto" w:fill="FFFFFF"/>
+            <w:tcMar>
+              <w:top w:w="60" w:type="dxa"/>
+              <w:left w:w="60" w:type="dxa"/>
+              <w:bottom w:w="60" w:type="dxa"/>
+              <w:right w:w="60" w:type="dxa"/>
+            </w:tcMar>
+          </w:tcPr>
+          <w:p>
+            <w:pPr>
+              <w:spacing w:before="20" w:after="20"/>
+            </w:pPr>
+            <w:r/>
+            <w:r>
+              <w:rPr>
+                <w:rFonts w:ascii="Calibri" w:hAnsi="Calibri" w:eastAsia="Calibri"/>
+                <w:b w:val="0"/>
+                <w:color w:val="1A1A1A"/>
+                <w:sz w:val="14"/>
+              </w:rPr>
+              <w:t>0054400000</w:t>
+            </w:r>
+          </w:p>
+        </w:tc>
+        <w:tc>
+          <w:tcPr>
+            <w:tcW w:type="dxa" w:w="1158"/>
+            <w:shd w:val="clear" w:color="auto" w:fill="FFFFFF"/>
+            <w:tcMar>
+              <w:top w:w="60" w:type="dxa"/>
+              <w:left w:w="60" w:type="dxa"/>
+              <w:bottom w:w="60" w:type="dxa"/>
+              <w:right w:w="60" w:type="dxa"/>
+            </w:tcMar>
+          </w:tcPr>
+          <w:p>
+            <w:pPr>
+              <w:spacing w:before="20" w:after="20"/>
+            </w:pPr>
+            <w:r/>
+            <w:r>
+              <w:rPr>
+                <w:rFonts w:ascii="Calibri" w:hAnsi="Calibri" w:eastAsia="Calibri"/>
+                <w:b w:val="0"/>
+                <w:color w:val="1A1A1A"/>
+                <w:sz w:val="14"/>
+              </w:rPr>
+              <w:t>S</w:t>
+            </w:r>
+          </w:p>
+        </w:tc>
+        <w:tc>
+          <w:tcPr>
+            <w:tcW w:type="dxa" w:w="1158"/>
+            <w:shd w:val="clear" w:color="auto" w:fill="FFFFFF"/>
+            <w:tcMar>
+              <w:top w:w="60" w:type="dxa"/>
+              <w:left w:w="60" w:type="dxa"/>
+              <w:bottom w:w="60" w:type="dxa"/>
+              <w:right w:w="60" w:type="dxa"/>
+            </w:tcMar>
+          </w:tcPr>
+          <w:p>
+            <w:pPr>
+              <w:spacing w:before="20" w:after="20"/>
+            </w:pPr>
+            <w:r/>
+            <w:r>
+              <w:rPr>
+                <w:rFonts w:ascii="Calibri" w:hAnsi="Calibri" w:eastAsia="Calibri"/>
+                <w:b w:val="0"/>
+                <w:color w:val="1A1A1A"/>
+                <w:sz w:val="14"/>
+              </w:rPr>
+              <w:t>121.00</w:t>
+            </w:r>
+          </w:p>
+        </w:tc>
+        <w:tc>
+          <w:tcPr>
+            <w:tcW w:type="dxa" w:w="1158"/>
+            <w:shd w:val="clear" w:color="auto" w:fill="FFFFFF"/>
+            <w:tcMar>
+              <w:top w:w="60" w:type="dxa"/>
+              <w:left w:w="60" w:type="dxa"/>
+              <w:bottom w:w="60" w:type="dxa"/>
+              <w:right w:w="60" w:type="dxa"/>
+            </w:tcMar>
+          </w:tcPr>
+          <w:p>
+            <w:pPr>
+              <w:spacing w:before="20" w:after="20"/>
+            </w:pPr>
+            <w:r/>
+            <w:r>
+              <w:rPr>
+                <w:rFonts w:ascii="Calibri" w:hAnsi="Calibri" w:eastAsia="Calibri"/>
+                <w:b w:val="0"/>
+                <w:color w:val="1A1A1A"/>
+                <w:sz w:val="14"/>
+              </w:rPr>
+              <w:t>00020</w:t>
+            </w:r>
+          </w:p>
+        </w:tc>
+        <w:tc>
+          <w:tcPr>
+            <w:tcW w:type="dxa" w:w="1158"/>
+            <w:shd w:val="clear" w:color="auto" w:fill="FFFFFF"/>
+            <w:tcMar>
+              <w:top w:w="60" w:type="dxa"/>
+              <w:left w:w="60" w:type="dxa"/>
+              <w:bottom w:w="60" w:type="dxa"/>
+              <w:right w:w="60" w:type="dxa"/>
+            </w:tcMar>
+          </w:tcPr>
+          <w:p>
+            <w:pPr>
+              <w:spacing w:before="20" w:after="20"/>
+            </w:pPr>
+            <w:r/>
+            <w:r>
+              <w:rPr>
+                <w:rFonts w:ascii="Calibri" w:hAnsi="Calibri" w:eastAsia="Calibri"/>
+                <w:b w:val="0"/>
+                <w:color w:val="1A1A1A"/>
+                <w:sz w:val="14"/>
+              </w:rPr>
+              <w:t>5000002952</w:t>
+            </w:r>
+          </w:p>
+        </w:tc>
+        <w:tc>
+          <w:tcPr>
+            <w:tcW w:type="dxa" w:w="1158"/>
+            <w:shd w:val="clear" w:color="auto" w:fill="FFFFFF"/>
+            <w:tcMar>
+              <w:top w:w="60" w:type="dxa"/>
+              <w:left w:w="60" w:type="dxa"/>
+              <w:bottom w:w="60" w:type="dxa"/>
+              <w:right w:w="60" w:type="dxa"/>
+            </w:tcMar>
+          </w:tcPr>
+          <w:p>
+            <w:pPr>
+              <w:spacing w:before="20" w:after="20"/>
+            </w:pPr>
+            <w:r/>
+            <w:r>
+              <w:rPr>
+                <w:rFonts w:ascii="Calibri" w:hAnsi="Calibri" w:eastAsia="Calibri"/>
+                <w:b w:val="0"/>
+                <w:color w:val="1A1A1A"/>
+                <w:sz w:val="14"/>
+              </w:rPr>
+            </w:r>
+          </w:p>
+        </w:tc>
+      </w:tr>
+      <w:tr>
+        <w:trPr>
+          <w:cantSplit/>
+        </w:trPr>
+        <w:tc>
+          <w:tcPr>
+            <w:tcW w:type="dxa" w:w="1158"/>
+            <w:shd w:val="clear" w:color="auto" w:fill="F3F6F9"/>
+            <w:tcMar>
+              <w:top w:w="60" w:type="dxa"/>
+              <w:left w:w="60" w:type="dxa"/>
+              <w:bottom w:w="60" w:type="dxa"/>
+              <w:right w:w="60" w:type="dxa"/>
+            </w:tcMar>
+          </w:tcPr>
+          <w:p>
+            <w:pPr>
+              <w:spacing w:before="20" w:after="20"/>
+            </w:pPr>
+            <w:r/>
+            <w:r>
+              <w:rPr>
+                <w:rFonts w:ascii="Calibri" w:hAnsi="Calibri" w:eastAsia="Calibri"/>
+                <w:b w:val="0"/>
+                <w:color w:val="1A1A1A"/>
+                <w:sz w:val="14"/>
+              </w:rPr>
+              <w:t>5000000004</w:t>
+            </w:r>
+          </w:p>
+        </w:tc>
+        <w:tc>
+          <w:tcPr>
+            <w:tcW w:type="dxa" w:w="1158"/>
+            <w:shd w:val="clear" w:color="auto" w:fill="F3F6F9"/>
+            <w:tcMar>
+              <w:top w:w="60" w:type="dxa"/>
+              <w:left w:w="60" w:type="dxa"/>
+              <w:bottom w:w="60" w:type="dxa"/>
+              <w:right w:w="60" w:type="dxa"/>
+            </w:tcMar>
+          </w:tcPr>
+          <w:p>
+            <w:pPr>
+              <w:spacing w:before="20" w:after="20"/>
+            </w:pPr>
+            <w:r/>
+            <w:r>
+              <w:rPr>
+                <w:rFonts w:ascii="Calibri" w:hAnsi="Calibri" w:eastAsia="Calibri"/>
+                <w:b w:val="0"/>
+                <w:color w:val="1A1A1A"/>
+                <w:sz w:val="14"/>
+              </w:rPr>
+              <w:t>WE</w:t>
+            </w:r>
+          </w:p>
+        </w:tc>
+        <w:tc>
+          <w:tcPr>
+            <w:tcW w:type="dxa" w:w="1158"/>
+            <w:shd w:val="clear" w:color="auto" w:fill="F3F6F9"/>
+            <w:tcMar>
+              <w:top w:w="60" w:type="dxa"/>
+              <w:left w:w="60" w:type="dxa"/>
+              <w:bottom w:w="60" w:type="dxa"/>
+              <w:right w:w="60" w:type="dxa"/>
+            </w:tcMar>
+          </w:tcPr>
+          <w:p>
+            <w:pPr>
+              <w:spacing w:before="20" w:after="20"/>
+            </w:pPr>
+            <w:r/>
+            <w:r>
+              <w:rPr>
+                <w:rFonts w:ascii="Calibri" w:hAnsi="Calibri" w:eastAsia="Calibri"/>
+                <w:b w:val="0"/>
+                <w:color w:val="1A1A1A"/>
+                <w:sz w:val="14"/>
+              </w:rPr>
+              <w:t>000004</w:t>
+            </w:r>
+          </w:p>
+        </w:tc>
+        <w:tc>
+          <w:tcPr>
+            <w:tcW w:type="dxa" w:w="1158"/>
+            <w:shd w:val="clear" w:color="auto" w:fill="F3F6F9"/>
+            <w:tcMar>
+              <w:top w:w="60" w:type="dxa"/>
+              <w:left w:w="60" w:type="dxa"/>
+              <w:bottom w:w="60" w:type="dxa"/>
+              <w:right w:w="60" w:type="dxa"/>
+            </w:tcMar>
+          </w:tcPr>
+          <w:p>
+            <w:pPr>
+              <w:spacing w:before="20" w:after="20"/>
+            </w:pPr>
+            <w:r/>
+            <w:r>
+              <w:rPr>
+                <w:rFonts w:ascii="Calibri" w:hAnsi="Calibri" w:eastAsia="Calibri"/>
+                <w:b w:val="0"/>
+                <w:color w:val="1A1A1A"/>
+                <w:sz w:val="14"/>
+              </w:rPr>
+              <w:t>0021120000</w:t>
+            </w:r>
+          </w:p>
+        </w:tc>
+        <w:tc>
+          <w:tcPr>
+            <w:tcW w:type="dxa" w:w="1158"/>
+            <w:shd w:val="clear" w:color="auto" w:fill="F3F6F9"/>
+            <w:tcMar>
+              <w:top w:w="60" w:type="dxa"/>
+              <w:left w:w="60" w:type="dxa"/>
+              <w:bottom w:w="60" w:type="dxa"/>
+              <w:right w:w="60" w:type="dxa"/>
+            </w:tcMar>
+          </w:tcPr>
+          <w:p>
+            <w:pPr>
+              <w:spacing w:before="20" w:after="20"/>
+            </w:pPr>
+            <w:r/>
+            <w:r>
+              <w:rPr>
+                <w:rFonts w:ascii="Calibri" w:hAnsi="Calibri" w:eastAsia="Calibri"/>
+                <w:b w:val="0"/>
+                <w:color w:val="1A1A1A"/>
+                <w:sz w:val="14"/>
+              </w:rPr>
+              <w:t>H</w:t>
+            </w:r>
+          </w:p>
+        </w:tc>
+        <w:tc>
+          <w:tcPr>
+            <w:tcW w:type="dxa" w:w="1158"/>
+            <w:shd w:val="clear" w:color="auto" w:fill="F3F6F9"/>
+            <w:tcMar>
+              <w:top w:w="60" w:type="dxa"/>
+              <w:left w:w="60" w:type="dxa"/>
+              <w:bottom w:w="60" w:type="dxa"/>
+              <w:right w:w="60" w:type="dxa"/>
+            </w:tcMar>
+          </w:tcPr>
+          <w:p>
+            <w:pPr>
+              <w:spacing w:before="20" w:after="20"/>
+            </w:pPr>
+            <w:r/>
+            <w:r>
+              <w:rPr>
+                <w:rFonts w:ascii="Calibri" w:hAnsi="Calibri" w:eastAsia="Calibri"/>
+                <w:b w:val="0"/>
+                <w:color w:val="1A1A1A"/>
+                <w:sz w:val="14"/>
+              </w:rPr>
+              <w:t>-121.00</w:t>
+            </w:r>
+          </w:p>
+        </w:tc>
+        <w:tc>
+          <w:tcPr>
+            <w:tcW w:type="dxa" w:w="1158"/>
+            <w:shd w:val="clear" w:color="auto" w:fill="F3F6F9"/>
+            <w:tcMar>
+              <w:top w:w="60" w:type="dxa"/>
+              <w:left w:w="60" w:type="dxa"/>
+              <w:bottom w:w="60" w:type="dxa"/>
+              <w:right w:w="60" w:type="dxa"/>
+            </w:tcMar>
+          </w:tcPr>
+          <w:p>
+            <w:pPr>
+              <w:spacing w:before="20" w:after="20"/>
+            </w:pPr>
+            <w:r/>
+            <w:r>
+              <w:rPr>
+                <w:rFonts w:ascii="Calibri" w:hAnsi="Calibri" w:eastAsia="Calibri"/>
+                <w:b w:val="0"/>
+                <w:color w:val="1A1A1A"/>
+                <w:sz w:val="14"/>
+              </w:rPr>
+              <w:t>00020</w:t>
+            </w:r>
+          </w:p>
+        </w:tc>
+        <w:tc>
+          <w:tcPr>
+            <w:tcW w:type="dxa" w:w="1158"/>
+            <w:shd w:val="clear" w:color="auto" w:fill="F3F6F9"/>
+            <w:tcMar>
+              <w:top w:w="60" w:type="dxa"/>
+              <w:left w:w="60" w:type="dxa"/>
+              <w:bottom w:w="60" w:type="dxa"/>
+              <w:right w:w="60" w:type="dxa"/>
+            </w:tcMar>
+          </w:tcPr>
+          <w:p>
+            <w:pPr>
+              <w:spacing w:before="20" w:after="20"/>
+            </w:pPr>
+            <w:r/>
+            <w:r>
+              <w:rPr>
+                <w:rFonts w:ascii="Calibri" w:hAnsi="Calibri" w:eastAsia="Calibri"/>
+                <w:b w:val="0"/>
+                <w:color w:val="1A1A1A"/>
+                <w:sz w:val="14"/>
+              </w:rPr>
+              <w:t>5000002952</w:t>
+            </w:r>
+          </w:p>
+        </w:tc>
+        <w:tc>
+          <w:tcPr>
+            <w:tcW w:type="dxa" w:w="1158"/>
+            <w:shd w:val="clear" w:color="auto" w:fill="F3F6F9"/>
+            <w:tcMar>
+              <w:top w:w="60" w:type="dxa"/>
+              <w:left w:w="60" w:type="dxa"/>
+              <w:bottom w:w="60" w:type="dxa"/>
+              <w:right w:w="60" w:type="dxa"/>
+            </w:tcMar>
+          </w:tcPr>
+          <w:p>
+            <w:pPr>
+              <w:spacing w:before="20" w:after="20"/>
+            </w:pPr>
+            <w:r/>
+            <w:r>
+              <w:rPr>
+                <w:rFonts w:ascii="Calibri" w:hAnsi="Calibri" w:eastAsia="Calibri"/>
+                <w:b w:val="0"/>
+                <w:color w:val="1A1A1A"/>
+                <w:sz w:val="14"/>
+              </w:rPr>
+            </w:r>
+          </w:p>
+        </w:tc>
+      </w:tr>
+      <w:tr>
+        <w:trPr>
+          <w:cantSplit/>
+        </w:trPr>
+        <w:tc>
+          <w:tcPr>
+            <w:tcW w:type="dxa" w:w="1158"/>
+            <w:shd w:val="clear" w:color="auto" w:fill="FFFFFF"/>
+            <w:tcMar>
+              <w:top w:w="60" w:type="dxa"/>
+              <w:left w:w="60" w:type="dxa"/>
+              <w:bottom w:w="60" w:type="dxa"/>
+              <w:right w:w="60" w:type="dxa"/>
+            </w:tcMar>
+          </w:tcPr>
+          <w:p>
+            <w:pPr>
+              <w:spacing w:before="20" w:after="20"/>
+            </w:pPr>
+            <w:r/>
+            <w:r>
+              <w:rPr>
+                <w:rFonts w:ascii="Calibri" w:hAnsi="Calibri" w:eastAsia="Calibri"/>
+                <w:b w:val="0"/>
+                <w:color w:val="1A1A1A"/>
+                <w:sz w:val="14"/>
+              </w:rPr>
+              <w:t>5100000003</w:t>
+            </w:r>
+          </w:p>
+        </w:tc>
+        <w:tc>
+          <w:tcPr>
+            <w:tcW w:type="dxa" w:w="1158"/>
+            <w:shd w:val="clear" w:color="auto" w:fill="FFFFFF"/>
+            <w:tcMar>
+              <w:top w:w="60" w:type="dxa"/>
+              <w:left w:w="60" w:type="dxa"/>
+              <w:bottom w:w="60" w:type="dxa"/>
+              <w:right w:w="60" w:type="dxa"/>
+            </w:tcMar>
+          </w:tcPr>
+          <w:p>
+            <w:pPr>
+              <w:spacing w:before="20" w:after="20"/>
+            </w:pPr>
+            <w:r/>
+            <w:r>
+              <w:rPr>
+                <w:rFonts w:ascii="Calibri" w:hAnsi="Calibri" w:eastAsia="Calibri"/>
+                <w:b w:val="0"/>
+                <w:color w:val="1A1A1A"/>
+                <w:sz w:val="14"/>
+              </w:rPr>
+              <w:t>RE</w:t>
+            </w:r>
+          </w:p>
+        </w:tc>
+        <w:tc>
+          <w:tcPr>
+            <w:tcW w:type="dxa" w:w="1158"/>
+            <w:shd w:val="clear" w:color="auto" w:fill="FFFFFF"/>
+            <w:tcMar>
+              <w:top w:w="60" w:type="dxa"/>
+              <w:left w:w="60" w:type="dxa"/>
+              <w:bottom w:w="60" w:type="dxa"/>
+              <w:right w:w="60" w:type="dxa"/>
+            </w:tcMar>
+          </w:tcPr>
+          <w:p>
+            <w:pPr>
+              <w:spacing w:before="20" w:after="20"/>
+            </w:pPr>
+            <w:r/>
+            <w:r>
+              <w:rPr>
+                <w:rFonts w:ascii="Calibri" w:hAnsi="Calibri" w:eastAsia="Calibri"/>
+                <w:b w:val="0"/>
+                <w:color w:val="1A1A1A"/>
+                <w:sz w:val="14"/>
+              </w:rPr>
+              <w:t>000001</w:t>
+            </w:r>
+          </w:p>
+        </w:tc>
+        <w:tc>
+          <w:tcPr>
+            <w:tcW w:type="dxa" w:w="1158"/>
+            <w:shd w:val="clear" w:color="auto" w:fill="FFFFFF"/>
+            <w:tcMar>
+              <w:top w:w="60" w:type="dxa"/>
+              <w:left w:w="60" w:type="dxa"/>
+              <w:bottom w:w="60" w:type="dxa"/>
+              <w:right w:w="60" w:type="dxa"/>
+            </w:tcMar>
+          </w:tcPr>
+          <w:p>
+            <w:pPr>
+              <w:spacing w:before="20" w:after="20"/>
+            </w:pPr>
+            <w:r/>
+            <w:r>
+              <w:rPr>
+                <w:rFonts w:ascii="Calibri" w:hAnsi="Calibri" w:eastAsia="Calibri"/>
+                <w:b w:val="0"/>
+                <w:color w:val="1A1A1A"/>
+                <w:sz w:val="14"/>
+              </w:rPr>
+              <w:t>0021100000</w:t>
+            </w:r>
+          </w:p>
+        </w:tc>
+        <w:tc>
+          <w:tcPr>
+            <w:tcW w:type="dxa" w:w="1158"/>
+            <w:shd w:val="clear" w:color="auto" w:fill="FFFFFF"/>
+            <w:tcMar>
+              <w:top w:w="60" w:type="dxa"/>
+              <w:left w:w="60" w:type="dxa"/>
+              <w:bottom w:w="60" w:type="dxa"/>
+              <w:right w:w="60" w:type="dxa"/>
+            </w:tcMar>
+          </w:tcPr>
+          <w:p>
+            <w:pPr>
+              <w:spacing w:before="20" w:after="20"/>
+            </w:pPr>
+            <w:r/>
+            <w:r>
+              <w:rPr>
+                <w:rFonts w:ascii="Calibri" w:hAnsi="Calibri" w:eastAsia="Calibri"/>
+                <w:b w:val="0"/>
+                <w:color w:val="1A1A1A"/>
+                <w:sz w:val="14"/>
+              </w:rPr>
+              <w:t>H</w:t>
+            </w:r>
+          </w:p>
+        </w:tc>
+        <w:tc>
+          <w:tcPr>
+            <w:tcW w:type="dxa" w:w="1158"/>
+            <w:shd w:val="clear" w:color="auto" w:fill="FFFFFF"/>
+            <w:tcMar>
+              <w:top w:w="60" w:type="dxa"/>
+              <w:left w:w="60" w:type="dxa"/>
+              <w:bottom w:w="60" w:type="dxa"/>
+              <w:right w:w="60" w:type="dxa"/>
+            </w:tcMar>
+          </w:tcPr>
+          <w:p>
+            <w:pPr>
+              <w:spacing w:before="20" w:after="20"/>
+            </w:pPr>
+            <w:r/>
+            <w:r>
+              <w:rPr>
+                <w:rFonts w:ascii="Calibri" w:hAnsi="Calibri" w:eastAsia="Calibri"/>
+                <w:b w:val="0"/>
+                <w:color w:val="1A1A1A"/>
+                <w:sz w:val="14"/>
+              </w:rPr>
+              <w:t>-221.00</w:t>
+            </w:r>
+          </w:p>
+        </w:tc>
+        <w:tc>
+          <w:tcPr>
+            <w:tcW w:type="dxa" w:w="1158"/>
+            <w:shd w:val="clear" w:color="auto" w:fill="FFFFFF"/>
+            <w:tcMar>
+              <w:top w:w="60" w:type="dxa"/>
+              <w:left w:w="60" w:type="dxa"/>
+              <w:bottom w:w="60" w:type="dxa"/>
+              <w:right w:w="60" w:type="dxa"/>
+            </w:tcMar>
+          </w:tcPr>
+          <w:p>
+            <w:pPr>
+              <w:spacing w:before="20" w:after="20"/>
+            </w:pPr>
+            <w:r/>
+            <w:r>
+              <w:rPr>
+                <w:rFonts w:ascii="Calibri" w:hAnsi="Calibri" w:eastAsia="Calibri"/>
+                <w:b w:val="0"/>
+                <w:color w:val="1A1A1A"/>
+                <w:sz w:val="14"/>
+              </w:rPr>
+            </w:r>
+          </w:p>
+        </w:tc>
+        <w:tc>
+          <w:tcPr>
+            <w:tcW w:type="dxa" w:w="1158"/>
+            <w:shd w:val="clear" w:color="auto" w:fill="FFFFFF"/>
+            <w:tcMar>
+              <w:top w:w="60" w:type="dxa"/>
+              <w:left w:w="60" w:type="dxa"/>
+              <w:bottom w:w="60" w:type="dxa"/>
+              <w:right w:w="60" w:type="dxa"/>
+            </w:tcMar>
+          </w:tcPr>
+          <w:p>
+            <w:pPr>
+              <w:spacing w:before="20" w:after="20"/>
+            </w:pPr>
+            <w:r/>
+            <w:r>
+              <w:rPr>
+                <w:rFonts w:ascii="Calibri" w:hAnsi="Calibri" w:eastAsia="Calibri"/>
+                <w:b w:val="0"/>
+                <w:color w:val="1A1A1A"/>
+                <w:sz w:val="14"/>
+              </w:rPr>
+              <w:t>5100001601</w:t>
+            </w:r>
+          </w:p>
+        </w:tc>
+        <w:tc>
+          <w:tcPr>
+            <w:tcW w:type="dxa" w:w="1158"/>
+            <w:shd w:val="clear" w:color="auto" w:fill="FFFFFF"/>
+            <w:tcMar>
+              <w:top w:w="60" w:type="dxa"/>
+              <w:left w:w="60" w:type="dxa"/>
+              <w:bottom w:w="60" w:type="dxa"/>
+              <w:right w:w="60" w:type="dxa"/>
+            </w:tcMar>
+          </w:tcPr>
+          <w:p>
+            <w:pPr>
+              <w:spacing w:before="20" w:after="20"/>
+            </w:pPr>
+            <w:r/>
+            <w:r>
+              <w:rPr>
+                <w:rFonts w:ascii="Calibri" w:hAnsi="Calibri" w:eastAsia="Calibri"/>
+                <w:b w:val="0"/>
+                <w:color w:val="1A1A1A"/>
+                <w:sz w:val="14"/>
+              </w:rPr>
+              <w:t>1500000002</w:t>
+            </w:r>
+          </w:p>
+        </w:tc>
+      </w:tr>
+      <w:tr>
+        <w:trPr>
+          <w:cantSplit/>
+        </w:trPr>
+        <w:tc>
+          <w:tcPr>
+            <w:tcW w:type="dxa" w:w="1158"/>
+            <w:shd w:val="clear" w:color="auto" w:fill="F3F6F9"/>
+            <w:tcMar>
+              <w:top w:w="60" w:type="dxa"/>
+              <w:left w:w="60" w:type="dxa"/>
+              <w:bottom w:w="60" w:type="dxa"/>
+              <w:right w:w="60" w:type="dxa"/>
+            </w:tcMar>
+          </w:tcPr>
+          <w:p>
+            <w:pPr>
+              <w:spacing w:before="20" w:after="20"/>
+            </w:pPr>
+            <w:r/>
+            <w:r>
+              <w:rPr>
+                <w:rFonts w:ascii="Calibri" w:hAnsi="Calibri" w:eastAsia="Calibri"/>
+                <w:b w:val="0"/>
+                <w:color w:val="1A1A1A"/>
+                <w:sz w:val="14"/>
+              </w:rPr>
+              <w:t>5100000003</w:t>
+            </w:r>
+          </w:p>
+        </w:tc>
+        <w:tc>
+          <w:tcPr>
+            <w:tcW w:type="dxa" w:w="1158"/>
+            <w:shd w:val="clear" w:color="auto" w:fill="F3F6F9"/>
+            <w:tcMar>
+              <w:top w:w="60" w:type="dxa"/>
+              <w:left w:w="60" w:type="dxa"/>
+              <w:bottom w:w="60" w:type="dxa"/>
+              <w:right w:w="60" w:type="dxa"/>
+            </w:tcMar>
+          </w:tcPr>
+          <w:p>
+            <w:pPr>
+              <w:spacing w:before="20" w:after="20"/>
+            </w:pPr>
+            <w:r/>
+            <w:r>
+              <w:rPr>
+                <w:rFonts w:ascii="Calibri" w:hAnsi="Calibri" w:eastAsia="Calibri"/>
+                <w:b w:val="0"/>
+                <w:color w:val="1A1A1A"/>
+                <w:sz w:val="14"/>
+              </w:rPr>
+              <w:t>RE</w:t>
+            </w:r>
+          </w:p>
+        </w:tc>
+        <w:tc>
+          <w:tcPr>
+            <w:tcW w:type="dxa" w:w="1158"/>
+            <w:shd w:val="clear" w:color="auto" w:fill="F3F6F9"/>
+            <w:tcMar>
+              <w:top w:w="60" w:type="dxa"/>
+              <w:left w:w="60" w:type="dxa"/>
+              <w:bottom w:w="60" w:type="dxa"/>
+              <w:right w:w="60" w:type="dxa"/>
+            </w:tcMar>
+          </w:tcPr>
+          <w:p>
+            <w:pPr>
+              <w:spacing w:before="20" w:after="20"/>
+            </w:pPr>
+            <w:r/>
+            <w:r>
+              <w:rPr>
+                <w:rFonts w:ascii="Calibri" w:hAnsi="Calibri" w:eastAsia="Calibri"/>
+                <w:b w:val="0"/>
+                <w:color w:val="1A1A1A"/>
+                <w:sz w:val="14"/>
+              </w:rPr>
+              <w:t>000002</w:t>
+            </w:r>
+          </w:p>
+        </w:tc>
+        <w:tc>
+          <w:tcPr>
+            <w:tcW w:type="dxa" w:w="1158"/>
+            <w:shd w:val="clear" w:color="auto" w:fill="F3F6F9"/>
+            <w:tcMar>
+              <w:top w:w="60" w:type="dxa"/>
+              <w:left w:w="60" w:type="dxa"/>
+              <w:bottom w:w="60" w:type="dxa"/>
+              <w:right w:w="60" w:type="dxa"/>
+            </w:tcMar>
+          </w:tcPr>
+          <w:p>
+            <w:pPr>
+              <w:spacing w:before="20" w:after="20"/>
+            </w:pPr>
+            <w:r/>
+            <w:r>
+              <w:rPr>
+                <w:rFonts w:ascii="Calibri" w:hAnsi="Calibri" w:eastAsia="Calibri"/>
+                <w:b w:val="0"/>
+                <w:color w:val="1A1A1A"/>
+                <w:sz w:val="14"/>
+              </w:rPr>
+              <w:t>0021120000</w:t>
+            </w:r>
+          </w:p>
+        </w:tc>
+        <w:tc>
+          <w:tcPr>
+            <w:tcW w:type="dxa" w:w="1158"/>
+            <w:shd w:val="clear" w:color="auto" w:fill="F3F6F9"/>
+            <w:tcMar>
+              <w:top w:w="60" w:type="dxa"/>
+              <w:left w:w="60" w:type="dxa"/>
+              <w:bottom w:w="60" w:type="dxa"/>
+              <w:right w:w="60" w:type="dxa"/>
+            </w:tcMar>
+          </w:tcPr>
+          <w:p>
+            <w:pPr>
+              <w:spacing w:before="20" w:after="20"/>
+            </w:pPr>
+            <w:r/>
+            <w:r>
+              <w:rPr>
+                <w:rFonts w:ascii="Calibri" w:hAnsi="Calibri" w:eastAsia="Calibri"/>
+                <w:b w:val="0"/>
+                <w:color w:val="1A1A1A"/>
+                <w:sz w:val="14"/>
+              </w:rPr>
+              <w:t>S</w:t>
+            </w:r>
+          </w:p>
+        </w:tc>
+        <w:tc>
+          <w:tcPr>
+            <w:tcW w:type="dxa" w:w="1158"/>
+            <w:shd w:val="clear" w:color="auto" w:fill="F3F6F9"/>
+            <w:tcMar>
+              <w:top w:w="60" w:type="dxa"/>
+              <w:left w:w="60" w:type="dxa"/>
+              <w:bottom w:w="60" w:type="dxa"/>
+              <w:right w:w="60" w:type="dxa"/>
+            </w:tcMar>
+          </w:tcPr>
+          <w:p>
+            <w:pPr>
+              <w:spacing w:before="20" w:after="20"/>
+            </w:pPr>
+            <w:r/>
+            <w:r>
+              <w:rPr>
+                <w:rFonts w:ascii="Calibri" w:hAnsi="Calibri" w:eastAsia="Calibri"/>
+                <w:b w:val="0"/>
+                <w:color w:val="1A1A1A"/>
+                <w:sz w:val="14"/>
+              </w:rPr>
+              <w:t>98.00</w:t>
+            </w:r>
+          </w:p>
+        </w:tc>
+        <w:tc>
+          <w:tcPr>
+            <w:tcW w:type="dxa" w:w="1158"/>
+            <w:shd w:val="clear" w:color="auto" w:fill="F3F6F9"/>
+            <w:tcMar>
+              <w:top w:w="60" w:type="dxa"/>
+              <w:left w:w="60" w:type="dxa"/>
+              <w:bottom w:w="60" w:type="dxa"/>
+              <w:right w:w="60" w:type="dxa"/>
+            </w:tcMar>
+          </w:tcPr>
+          <w:p>
+            <w:pPr>
+              <w:spacing w:before="20" w:after="20"/>
+            </w:pPr>
+            <w:r/>
+            <w:r>
+              <w:rPr>
+                <w:rFonts w:ascii="Calibri" w:hAnsi="Calibri" w:eastAsia="Calibri"/>
+                <w:b w:val="0"/>
+                <w:color w:val="1A1A1A"/>
+                <w:sz w:val="14"/>
+              </w:rPr>
+              <w:t>00010</w:t>
+            </w:r>
+          </w:p>
+        </w:tc>
+        <w:tc>
+          <w:tcPr>
+            <w:tcW w:type="dxa" w:w="1158"/>
+            <w:shd w:val="clear" w:color="auto" w:fill="F3F6F9"/>
+            <w:tcMar>
+              <w:top w:w="60" w:type="dxa"/>
+              <w:left w:w="60" w:type="dxa"/>
+              <w:bottom w:w="60" w:type="dxa"/>
+              <w:right w:w="60" w:type="dxa"/>
+            </w:tcMar>
+          </w:tcPr>
+          <w:p>
+            <w:pPr>
+              <w:spacing w:before="20" w:after="20"/>
+            </w:pPr>
+            <w:r/>
+            <w:r>
+              <w:rPr>
+                <w:rFonts w:ascii="Calibri" w:hAnsi="Calibri" w:eastAsia="Calibri"/>
+                <w:b w:val="0"/>
+                <w:color w:val="1A1A1A"/>
+                <w:sz w:val="14"/>
+              </w:rPr>
+              <w:t>5100001601</w:t>
+            </w:r>
+          </w:p>
+        </w:tc>
+        <w:tc>
+          <w:tcPr>
+            <w:tcW w:type="dxa" w:w="1158"/>
+            <w:shd w:val="clear" w:color="auto" w:fill="F3F6F9"/>
+            <w:tcMar>
+              <w:top w:w="60" w:type="dxa"/>
+              <w:left w:w="60" w:type="dxa"/>
+              <w:bottom w:w="60" w:type="dxa"/>
+              <w:right w:w="60" w:type="dxa"/>
+            </w:tcMar>
+          </w:tcPr>
+          <w:p>
+            <w:pPr>
+              <w:spacing w:before="20" w:after="20"/>
+            </w:pPr>
+            <w:r/>
+            <w:r>
+              <w:rPr>
+                <w:rFonts w:ascii="Calibri" w:hAnsi="Calibri" w:eastAsia="Calibri"/>
+                <w:b w:val="0"/>
+                <w:color w:val="1A1A1A"/>
+                <w:sz w:val="14"/>
+              </w:rPr>
+            </w:r>
+          </w:p>
+        </w:tc>
+      </w:tr>
+      <w:tr>
+        <w:trPr>
+          <w:cantSplit/>
+        </w:trPr>
+        <w:tc>
+          <w:tcPr>
+            <w:tcW w:type="dxa" w:w="1158"/>
+            <w:shd w:val="clear" w:color="auto" w:fill="FFFFFF"/>
+            <w:tcMar>
+              <w:top w:w="60" w:type="dxa"/>
+              <w:left w:w="60" w:type="dxa"/>
+              <w:bottom w:w="60" w:type="dxa"/>
+              <w:right w:w="60" w:type="dxa"/>
+            </w:tcMar>
+          </w:tcPr>
+          <w:p>
+            <w:pPr>
+              <w:spacing w:before="20" w:after="20"/>
+            </w:pPr>
+            <w:r/>
+            <w:r>
+              <w:rPr>
+                <w:rFonts w:ascii="Calibri" w:hAnsi="Calibri" w:eastAsia="Calibri"/>
+                <w:b w:val="0"/>
+                <w:color w:val="1A1A1A"/>
+                <w:sz w:val="14"/>
+              </w:rPr>
+              <w:t>5100000003</w:t>
+            </w:r>
+          </w:p>
+        </w:tc>
+        <w:tc>
+          <w:tcPr>
+            <w:tcW w:type="dxa" w:w="1158"/>
+            <w:shd w:val="clear" w:color="auto" w:fill="FFFFFF"/>
+            <w:tcMar>
+              <w:top w:w="60" w:type="dxa"/>
+              <w:left w:w="60" w:type="dxa"/>
+              <w:bottom w:w="60" w:type="dxa"/>
+              <w:right w:w="60" w:type="dxa"/>
+            </w:tcMar>
+          </w:tcPr>
+          <w:p>
+            <w:pPr>
+              <w:spacing w:before="20" w:after="20"/>
+            </w:pPr>
+            <w:r/>
+            <w:r>
+              <w:rPr>
+                <w:rFonts w:ascii="Calibri" w:hAnsi="Calibri" w:eastAsia="Calibri"/>
+                <w:b w:val="0"/>
+                <w:color w:val="1A1A1A"/>
+                <w:sz w:val="14"/>
+              </w:rPr>
+              <w:t>RE</w:t>
+            </w:r>
+          </w:p>
+        </w:tc>
+        <w:tc>
+          <w:tcPr>
+            <w:tcW w:type="dxa" w:w="1158"/>
+            <w:shd w:val="clear" w:color="auto" w:fill="FFFFFF"/>
+            <w:tcMar>
+              <w:top w:w="60" w:type="dxa"/>
+              <w:left w:w="60" w:type="dxa"/>
+              <w:bottom w:w="60" w:type="dxa"/>
+              <w:right w:w="60" w:type="dxa"/>
+            </w:tcMar>
+          </w:tcPr>
+          <w:p>
+            <w:pPr>
+              <w:spacing w:before="20" w:after="20"/>
+            </w:pPr>
+            <w:r/>
+            <w:r>
+              <w:rPr>
+                <w:rFonts w:ascii="Calibri" w:hAnsi="Calibri" w:eastAsia="Calibri"/>
+                <w:b w:val="0"/>
+                <w:color w:val="1A1A1A"/>
+                <w:sz w:val="14"/>
+              </w:rPr>
+              <w:t>000003</w:t>
+            </w:r>
+          </w:p>
+        </w:tc>
+        <w:tc>
+          <w:tcPr>
+            <w:tcW w:type="dxa" w:w="1158"/>
+            <w:shd w:val="clear" w:color="auto" w:fill="FFFFFF"/>
+            <w:tcMar>
+              <w:top w:w="60" w:type="dxa"/>
+              <w:left w:w="60" w:type="dxa"/>
+              <w:bottom w:w="60" w:type="dxa"/>
+              <w:right w:w="60" w:type="dxa"/>
+            </w:tcMar>
+          </w:tcPr>
+          <w:p>
+            <w:pPr>
+              <w:spacing w:before="20" w:after="20"/>
+            </w:pPr>
+            <w:r/>
+            <w:r>
+              <w:rPr>
+                <w:rFonts w:ascii="Calibri" w:hAnsi="Calibri" w:eastAsia="Calibri"/>
+                <w:b w:val="0"/>
+                <w:color w:val="1A1A1A"/>
+                <w:sz w:val="14"/>
+              </w:rPr>
+              <w:t>0021120000</w:t>
+            </w:r>
+          </w:p>
+        </w:tc>
+        <w:tc>
+          <w:tcPr>
+            <w:tcW w:type="dxa" w:w="1158"/>
+            <w:shd w:val="clear" w:color="auto" w:fill="FFFFFF"/>
+            <w:tcMar>
+              <w:top w:w="60" w:type="dxa"/>
+              <w:left w:w="60" w:type="dxa"/>
+              <w:bottom w:w="60" w:type="dxa"/>
+              <w:right w:w="60" w:type="dxa"/>
+            </w:tcMar>
+          </w:tcPr>
+          <w:p>
+            <w:pPr>
+              <w:spacing w:before="20" w:after="20"/>
+            </w:pPr>
+            <w:r/>
+            <w:r>
+              <w:rPr>
+                <w:rFonts w:ascii="Calibri" w:hAnsi="Calibri" w:eastAsia="Calibri"/>
+                <w:b w:val="0"/>
+                <w:color w:val="1A1A1A"/>
+                <w:sz w:val="14"/>
+              </w:rPr>
+              <w:t>S</w:t>
+            </w:r>
+          </w:p>
+        </w:tc>
+        <w:tc>
+          <w:tcPr>
+            <w:tcW w:type="dxa" w:w="1158"/>
+            <w:shd w:val="clear" w:color="auto" w:fill="FFFFFF"/>
+            <w:tcMar>
+              <w:top w:w="60" w:type="dxa"/>
+              <w:left w:w="60" w:type="dxa"/>
+              <w:bottom w:w="60" w:type="dxa"/>
+              <w:right w:w="60" w:type="dxa"/>
+            </w:tcMar>
+          </w:tcPr>
+          <w:p>
+            <w:pPr>
+              <w:spacing w:before="20" w:after="20"/>
+            </w:pPr>
+            <w:r/>
+            <w:r>
+              <w:rPr>
+                <w:rFonts w:ascii="Calibri" w:hAnsi="Calibri" w:eastAsia="Calibri"/>
+                <w:b w:val="0"/>
+                <w:color w:val="1A1A1A"/>
+                <w:sz w:val="14"/>
+              </w:rPr>
+              <w:t>121.00</w:t>
+            </w:r>
+          </w:p>
+        </w:tc>
+        <w:tc>
+          <w:tcPr>
+            <w:tcW w:type="dxa" w:w="1158"/>
+            <w:shd w:val="clear" w:color="auto" w:fill="FFFFFF"/>
+            <w:tcMar>
+              <w:top w:w="60" w:type="dxa"/>
+              <w:left w:w="60" w:type="dxa"/>
+              <w:bottom w:w="60" w:type="dxa"/>
+              <w:right w:w="60" w:type="dxa"/>
+            </w:tcMar>
+          </w:tcPr>
+          <w:p>
+            <w:pPr>
+              <w:spacing w:before="20" w:after="20"/>
+            </w:pPr>
+            <w:r/>
+            <w:r>
+              <w:rPr>
+                <w:rFonts w:ascii="Calibri" w:hAnsi="Calibri" w:eastAsia="Calibri"/>
+                <w:b w:val="0"/>
+                <w:color w:val="1A1A1A"/>
+                <w:sz w:val="14"/>
+              </w:rPr>
+              <w:t>00020</w:t>
+            </w:r>
+          </w:p>
+        </w:tc>
+        <w:tc>
+          <w:tcPr>
+            <w:tcW w:type="dxa" w:w="1158"/>
+            <w:shd w:val="clear" w:color="auto" w:fill="FFFFFF"/>
+            <w:tcMar>
+              <w:top w:w="60" w:type="dxa"/>
+              <w:left w:w="60" w:type="dxa"/>
+              <w:bottom w:w="60" w:type="dxa"/>
+              <w:right w:w="60" w:type="dxa"/>
+            </w:tcMar>
+          </w:tcPr>
+          <w:p>
+            <w:pPr>
+              <w:spacing w:before="20" w:after="20"/>
+            </w:pPr>
+            <w:r/>
+            <w:r>
+              <w:rPr>
+                <w:rFonts w:ascii="Calibri" w:hAnsi="Calibri" w:eastAsia="Calibri"/>
+                <w:b w:val="0"/>
+                <w:color w:val="1A1A1A"/>
+                <w:sz w:val="14"/>
+              </w:rPr>
+              <w:t>5100001601</w:t>
+            </w:r>
+          </w:p>
+        </w:tc>
+        <w:tc>
+          <w:tcPr>
+            <w:tcW w:type="dxa" w:w="1158"/>
+            <w:shd w:val="clear" w:color="auto" w:fill="FFFFFF"/>
+            <w:tcMar>
+              <w:top w:w="60" w:type="dxa"/>
+              <w:left w:w="60" w:type="dxa"/>
+              <w:bottom w:w="60" w:type="dxa"/>
+              <w:right w:w="60" w:type="dxa"/>
+            </w:tcMar>
+          </w:tcPr>
+          <w:p>
+            <w:pPr>
+              <w:spacing w:before="20" w:after="20"/>
+            </w:pPr>
+            <w:r/>
+            <w:r>
+              <w:rPr>
+                <w:rFonts w:ascii="Calibri" w:hAnsi="Calibri" w:eastAsia="Calibri"/>
+                <w:b w:val="0"/>
+                <w:color w:val="1A1A1A"/>
+                <w:sz w:val="14"/>
+              </w:rPr>
+            </w:r>
+          </w:p>
+        </w:tc>
+      </w:tr>
+      <w:tr>
+        <w:trPr>
+          <w:cantSplit/>
+        </w:trPr>
+        <w:tc>
+          <w:tcPr>
+            <w:tcW w:type="dxa" w:w="1158"/>
+            <w:shd w:val="clear" w:color="auto" w:fill="F3F6F9"/>
+            <w:tcMar>
+              <w:top w:w="60" w:type="dxa"/>
+              <w:left w:w="60" w:type="dxa"/>
+              <w:bottom w:w="60" w:type="dxa"/>
+              <w:right w:w="60" w:type="dxa"/>
+            </w:tcMar>
+          </w:tcPr>
+          <w:p>
+            <w:pPr>
+              <w:spacing w:before="20" w:after="20"/>
+            </w:pPr>
+            <w:r/>
+            <w:r>
+              <w:rPr>
+                <w:rFonts w:ascii="Calibri" w:hAnsi="Calibri" w:eastAsia="Calibri"/>
+                <w:b w:val="0"/>
+                <w:color w:val="1A1A1A"/>
+                <w:sz w:val="14"/>
+              </w:rPr>
+              <w:t>5100000003</w:t>
+            </w:r>
+          </w:p>
+        </w:tc>
+        <w:tc>
+          <w:tcPr>
+            <w:tcW w:type="dxa" w:w="1158"/>
+            <w:shd w:val="clear" w:color="auto" w:fill="F3F6F9"/>
+            <w:tcMar>
+              <w:top w:w="60" w:type="dxa"/>
+              <w:left w:w="60" w:type="dxa"/>
+              <w:bottom w:w="60" w:type="dxa"/>
+              <w:right w:w="60" w:type="dxa"/>
+            </w:tcMar>
+          </w:tcPr>
+          <w:p>
+            <w:pPr>
+              <w:spacing w:before="20" w:after="20"/>
+            </w:pPr>
+            <w:r/>
+            <w:r>
+              <w:rPr>
+                <w:rFonts w:ascii="Calibri" w:hAnsi="Calibri" w:eastAsia="Calibri"/>
+                <w:b w:val="0"/>
+                <w:color w:val="1A1A1A"/>
+                <w:sz w:val="14"/>
+              </w:rPr>
+              <w:t>RE</w:t>
+            </w:r>
+          </w:p>
+        </w:tc>
+        <w:tc>
+          <w:tcPr>
+            <w:tcW w:type="dxa" w:w="1158"/>
+            <w:shd w:val="clear" w:color="auto" w:fill="F3F6F9"/>
+            <w:tcMar>
+              <w:top w:w="60" w:type="dxa"/>
+              <w:left w:w="60" w:type="dxa"/>
+              <w:bottom w:w="60" w:type="dxa"/>
+              <w:right w:w="60" w:type="dxa"/>
+            </w:tcMar>
+          </w:tcPr>
+          <w:p>
+            <w:pPr>
+              <w:spacing w:before="20" w:after="20"/>
+            </w:pPr>
+            <w:r/>
+            <w:r>
+              <w:rPr>
+                <w:rFonts w:ascii="Calibri" w:hAnsi="Calibri" w:eastAsia="Calibri"/>
+                <w:b w:val="0"/>
+                <w:color w:val="1A1A1A"/>
+                <w:sz w:val="14"/>
+              </w:rPr>
+              <w:t>000004</w:t>
+            </w:r>
+          </w:p>
+        </w:tc>
+        <w:tc>
+          <w:tcPr>
+            <w:tcW w:type="dxa" w:w="1158"/>
+            <w:shd w:val="clear" w:color="auto" w:fill="F3F6F9"/>
+            <w:tcMar>
+              <w:top w:w="60" w:type="dxa"/>
+              <w:left w:w="60" w:type="dxa"/>
+              <w:bottom w:w="60" w:type="dxa"/>
+              <w:right w:w="60" w:type="dxa"/>
+            </w:tcMar>
+          </w:tcPr>
+          <w:p>
+            <w:pPr>
+              <w:spacing w:before="20" w:after="20"/>
+            </w:pPr>
+            <w:r/>
+            <w:r>
+              <w:rPr>
+                <w:rFonts w:ascii="Calibri" w:hAnsi="Calibri" w:eastAsia="Calibri"/>
+                <w:b w:val="0"/>
+                <w:color w:val="1A1A1A"/>
+                <w:sz w:val="14"/>
+              </w:rPr>
+              <w:t>0052060000</w:t>
+            </w:r>
+          </w:p>
+        </w:tc>
+        <w:tc>
+          <w:tcPr>
+            <w:tcW w:type="dxa" w:w="1158"/>
+            <w:shd w:val="clear" w:color="auto" w:fill="F3F6F9"/>
+            <w:tcMar>
+              <w:top w:w="60" w:type="dxa"/>
+              <w:left w:w="60" w:type="dxa"/>
+              <w:bottom w:w="60" w:type="dxa"/>
+              <w:right w:w="60" w:type="dxa"/>
+            </w:tcMar>
+          </w:tcPr>
+          <w:p>
+            <w:pPr>
+              <w:spacing w:before="20" w:after="20"/>
+            </w:pPr>
+            <w:r/>
+            <w:r>
+              <w:rPr>
+                <w:rFonts w:ascii="Calibri" w:hAnsi="Calibri" w:eastAsia="Calibri"/>
+                <w:b w:val="0"/>
+                <w:color w:val="1A1A1A"/>
+                <w:sz w:val="14"/>
+              </w:rPr>
+              <w:t>S</w:t>
+            </w:r>
+          </w:p>
+        </w:tc>
+        <w:tc>
+          <w:tcPr>
+            <w:tcW w:type="dxa" w:w="1158"/>
+            <w:shd w:val="clear" w:color="auto" w:fill="F3F6F9"/>
+            <w:tcMar>
+              <w:top w:w="60" w:type="dxa"/>
+              <w:left w:w="60" w:type="dxa"/>
+              <w:bottom w:w="60" w:type="dxa"/>
+              <w:right w:w="60" w:type="dxa"/>
+            </w:tcMar>
+          </w:tcPr>
+          <w:p>
+            <w:pPr>
+              <w:spacing w:before="20" w:after="20"/>
+            </w:pPr>
+            <w:r/>
+            <w:r>
+              <w:rPr>
+                <w:rFonts w:ascii="Calibri" w:hAnsi="Calibri" w:eastAsia="Calibri"/>
+                <w:b w:val="0"/>
+                <w:color w:val="1A1A1A"/>
+                <w:sz w:val="14"/>
+              </w:rPr>
+              <w:t>2.00</w:t>
+            </w:r>
+          </w:p>
+        </w:tc>
+        <w:tc>
+          <w:tcPr>
+            <w:tcW w:type="dxa" w:w="1158"/>
+            <w:shd w:val="clear" w:color="auto" w:fill="F3F6F9"/>
+            <w:tcMar>
+              <w:top w:w="60" w:type="dxa"/>
+              <w:left w:w="60" w:type="dxa"/>
+              <w:bottom w:w="60" w:type="dxa"/>
+              <w:right w:w="60" w:type="dxa"/>
+            </w:tcMar>
+          </w:tcPr>
+          <w:p>
+            <w:pPr>
+              <w:spacing w:before="20" w:after="20"/>
+            </w:pPr>
+            <w:r/>
+            <w:r>
+              <w:rPr>
+                <w:rFonts w:ascii="Calibri" w:hAnsi="Calibri" w:eastAsia="Calibri"/>
+                <w:b w:val="0"/>
+                <w:color w:val="1A1A1A"/>
+                <w:sz w:val="14"/>
+              </w:rPr>
+            </w:r>
+          </w:p>
+        </w:tc>
+        <w:tc>
+          <w:tcPr>
+            <w:tcW w:type="dxa" w:w="1158"/>
+            <w:shd w:val="clear" w:color="auto" w:fill="F3F6F9"/>
+            <w:tcMar>
+              <w:top w:w="60" w:type="dxa"/>
+              <w:left w:w="60" w:type="dxa"/>
+              <w:bottom w:w="60" w:type="dxa"/>
+              <w:right w:w="60" w:type="dxa"/>
+            </w:tcMar>
+          </w:tcPr>
+          <w:p>
+            <w:pPr>
+              <w:spacing w:before="20" w:after="20"/>
+            </w:pPr>
+            <w:r/>
+            <w:r>
+              <w:rPr>
+                <w:rFonts w:ascii="Calibri" w:hAnsi="Calibri" w:eastAsia="Calibri"/>
+                <w:b w:val="0"/>
+                <w:color w:val="1A1A1A"/>
+                <w:sz w:val="14"/>
+              </w:rPr>
+              <w:t>5100001601</w:t>
+            </w:r>
+          </w:p>
+        </w:tc>
+        <w:tc>
+          <w:tcPr>
+            <w:tcW w:type="dxa" w:w="1158"/>
+            <w:shd w:val="clear" w:color="auto" w:fill="F3F6F9"/>
+            <w:tcMar>
+              <w:top w:w="60" w:type="dxa"/>
+              <w:left w:w="60" w:type="dxa"/>
+              <w:bottom w:w="60" w:type="dxa"/>
+              <w:right w:w="60" w:type="dxa"/>
+            </w:tcMar>
+          </w:tcPr>
+          <w:p>
+            <w:pPr>
+              <w:spacing w:before="20" w:after="20"/>
+            </w:pPr>
+            <w:r/>
+            <w:r>
+              <w:rPr>
+                <w:rFonts w:ascii="Calibri" w:hAnsi="Calibri" w:eastAsia="Calibri"/>
+                <w:b w:val="0"/>
+                <w:color w:val="1A1A1A"/>
+                <w:sz w:val="14"/>
+              </w:rPr>
             </w:r>
           </w:p>
         </w:tc>
@@ -5007,6 +6732,20 @@
       <w:pPr>
         <w:spacing w:after="120"/>
       </w:pPr>
+    </w:p>
+    <w:p>
+      <w:pPr>
+        <w:spacing w:after="160" w:before="0" w:line="259" w:lineRule="auto"/>
+      </w:pPr>
+      <w:r>
+        <w:rPr>
+          <w:rFonts w:ascii="Calibri" w:hAnsi="Calibri" w:eastAsia="Calibri"/>
+          <w:b w:val="0"/>
+          <w:color w:val="1A1A1A"/>
+          <w:sz w:val="22"/>
+        </w:rPr>
+        <w:t>The goods receipt debits expense 0054400000 and credits GR/IR 0021120000 for 98.00 and 121.00. The invoice debits GR/IR for the same amounts, debits 0052060000 for 2.00 on cost center 0017101101, and credits vendor 0021100000 for 221.00. GR/IR nets to 0.00.</w:t>
+      </w:r>
     </w:p>
     <w:p>
       <w:pPr>
@@ -5819,8 +7558,1023 @@
           <w:color w:val="1A1A1A"/>
           <w:sz w:val="22"/>
         </w:rPr>
-        <w:t>Supplier invoice 5100001601 is posted. A payment would be a later journal document whose clearing fields point at the vendor line of that invoice. This extract set does not include I_GLAccountLineItemRawData, so that payment is not in the sample.</w:t>
+        <w:t>Payment 1500000002, document type KZ, posting date 20261013, amount 221.00 USD. It credits bank G/L 0011002000 and debits vendor 0021100000 for supplier 0001000579. The vendor line of invoice journal 5100000003 has clearing date 20261013 and clearing document 1500000002. The vendor balance for this invoice is 0.00.</w:t>
       </w:r>
+    </w:p>
+    <w:tbl>
+      <w:tblPr>
+        <w:tblStyle w:val="TableGrid"/>
+        <w:tblW w:type="auto" w:w="0"/>
+        <w:jc w:val="center"/>
+        <w:tblLayout w:type="autofit"/>
+        <w:tblLook w:firstColumn="1" w:firstRow="1" w:lastColumn="0" w:lastRow="0" w:noHBand="0" w:noVBand="1" w:val="04A0"/>
+      </w:tblPr>
+      <w:tblGrid>
+        <w:gridCol w:w="1158"/>
+        <w:gridCol w:w="1158"/>
+        <w:gridCol w:w="1158"/>
+        <w:gridCol w:w="1158"/>
+        <w:gridCol w:w="1158"/>
+        <w:gridCol w:w="1158"/>
+        <w:gridCol w:w="1158"/>
+        <w:gridCol w:w="1158"/>
+        <w:gridCol w:w="1158"/>
+      </w:tblGrid>
+      <w:tr>
+        <w:trPr>
+          <w:tblHeader/>
+          <w:cantSplit/>
+        </w:trPr>
+        <w:tc>
+          <w:tcPr>
+            <w:tcW w:type="dxa" w:w="1158"/>
+            <w:shd w:val="clear" w:color="auto" w:fill="1F4E79"/>
+            <w:tcMar>
+              <w:top w:w="60" w:type="dxa"/>
+              <w:left w:w="60" w:type="dxa"/>
+              <w:bottom w:w="60" w:type="dxa"/>
+              <w:right w:w="60" w:type="dxa"/>
+            </w:tcMar>
+          </w:tcPr>
+          <w:p>
+            <w:pPr>
+              <w:spacing w:before="20" w:after="20"/>
+            </w:pPr>
+            <w:r/>
+            <w:r>
+              <w:rPr>
+                <w:rFonts w:ascii="Calibri" w:hAnsi="Calibri" w:eastAsia="Calibri"/>
+                <w:b/>
+                <w:color w:val="FFFFFF"/>
+                <w:sz w:val="16"/>
+              </w:rPr>
+              <w:t>FI document</w:t>
+            </w:r>
+          </w:p>
+        </w:tc>
+        <w:tc>
+          <w:tcPr>
+            <w:tcW w:type="dxa" w:w="1158"/>
+            <w:shd w:val="clear" w:color="auto" w:fill="1F4E79"/>
+            <w:tcMar>
+              <w:top w:w="60" w:type="dxa"/>
+              <w:left w:w="60" w:type="dxa"/>
+              <w:bottom w:w="60" w:type="dxa"/>
+              <w:right w:w="60" w:type="dxa"/>
+            </w:tcMar>
+          </w:tcPr>
+          <w:p>
+            <w:pPr>
+              <w:spacing w:before="20" w:after="20"/>
+            </w:pPr>
+            <w:r/>
+            <w:r>
+              <w:rPr>
+                <w:rFonts w:ascii="Calibri" w:hAnsi="Calibri" w:eastAsia="Calibri"/>
+                <w:b/>
+                <w:color w:val="FFFFFF"/>
+                <w:sz w:val="16"/>
+              </w:rPr>
+              <w:t>Type</w:t>
+            </w:r>
+          </w:p>
+        </w:tc>
+        <w:tc>
+          <w:tcPr>
+            <w:tcW w:type="dxa" w:w="1158"/>
+            <w:shd w:val="clear" w:color="auto" w:fill="1F4E79"/>
+            <w:tcMar>
+              <w:top w:w="60" w:type="dxa"/>
+              <w:left w:w="60" w:type="dxa"/>
+              <w:bottom w:w="60" w:type="dxa"/>
+              <w:right w:w="60" w:type="dxa"/>
+            </w:tcMar>
+          </w:tcPr>
+          <w:p>
+            <w:pPr>
+              <w:spacing w:before="20" w:after="20"/>
+            </w:pPr>
+            <w:r/>
+            <w:r>
+              <w:rPr>
+                <w:rFonts w:ascii="Calibri" w:hAnsi="Calibri" w:eastAsia="Calibri"/>
+                <w:b/>
+                <w:color w:val="FFFFFF"/>
+                <w:sz w:val="16"/>
+              </w:rPr>
+              <w:t>Line</w:t>
+            </w:r>
+          </w:p>
+        </w:tc>
+        <w:tc>
+          <w:tcPr>
+            <w:tcW w:type="dxa" w:w="1158"/>
+            <w:shd w:val="clear" w:color="auto" w:fill="1F4E79"/>
+            <w:tcMar>
+              <w:top w:w="60" w:type="dxa"/>
+              <w:left w:w="60" w:type="dxa"/>
+              <w:bottom w:w="60" w:type="dxa"/>
+              <w:right w:w="60" w:type="dxa"/>
+            </w:tcMar>
+          </w:tcPr>
+          <w:p>
+            <w:pPr>
+              <w:spacing w:before="20" w:after="20"/>
+            </w:pPr>
+            <w:r/>
+            <w:r>
+              <w:rPr>
+                <w:rFonts w:ascii="Calibri" w:hAnsi="Calibri" w:eastAsia="Calibri"/>
+                <w:b/>
+                <w:color w:val="FFFFFF"/>
+                <w:sz w:val="16"/>
+              </w:rPr>
+              <w:t>G/L</w:t>
+            </w:r>
+          </w:p>
+        </w:tc>
+        <w:tc>
+          <w:tcPr>
+            <w:tcW w:type="dxa" w:w="1158"/>
+            <w:shd w:val="clear" w:color="auto" w:fill="1F4E79"/>
+            <w:tcMar>
+              <w:top w:w="60" w:type="dxa"/>
+              <w:left w:w="60" w:type="dxa"/>
+              <w:bottom w:w="60" w:type="dxa"/>
+              <w:right w:w="60" w:type="dxa"/>
+            </w:tcMar>
+          </w:tcPr>
+          <w:p>
+            <w:pPr>
+              <w:spacing w:before="20" w:after="20"/>
+            </w:pPr>
+            <w:r/>
+            <w:r>
+              <w:rPr>
+                <w:rFonts w:ascii="Calibri" w:hAnsi="Calibri" w:eastAsia="Calibri"/>
+                <w:b/>
+                <w:color w:val="FFFFFF"/>
+                <w:sz w:val="16"/>
+              </w:rPr>
+              <w:t>D/C</w:t>
+            </w:r>
+          </w:p>
+        </w:tc>
+        <w:tc>
+          <w:tcPr>
+            <w:tcW w:type="dxa" w:w="1158"/>
+            <w:shd w:val="clear" w:color="auto" w:fill="1F4E79"/>
+            <w:tcMar>
+              <w:top w:w="60" w:type="dxa"/>
+              <w:left w:w="60" w:type="dxa"/>
+              <w:bottom w:w="60" w:type="dxa"/>
+              <w:right w:w="60" w:type="dxa"/>
+            </w:tcMar>
+          </w:tcPr>
+          <w:p>
+            <w:pPr>
+              <w:spacing w:before="20" w:after="20"/>
+            </w:pPr>
+            <w:r/>
+            <w:r>
+              <w:rPr>
+                <w:rFonts w:ascii="Calibri" w:hAnsi="Calibri" w:eastAsia="Calibri"/>
+                <w:b/>
+                <w:color w:val="FFFFFF"/>
+                <w:sz w:val="16"/>
+              </w:rPr>
+              <w:t>Amount</w:t>
+            </w:r>
+          </w:p>
+        </w:tc>
+        <w:tc>
+          <w:tcPr>
+            <w:tcW w:type="dxa" w:w="1158"/>
+            <w:shd w:val="clear" w:color="auto" w:fill="1F4E79"/>
+            <w:tcMar>
+              <w:top w:w="60" w:type="dxa"/>
+              <w:left w:w="60" w:type="dxa"/>
+              <w:bottom w:w="60" w:type="dxa"/>
+              <w:right w:w="60" w:type="dxa"/>
+            </w:tcMar>
+          </w:tcPr>
+          <w:p>
+            <w:pPr>
+              <w:spacing w:before="20" w:after="20"/>
+            </w:pPr>
+            <w:r/>
+            <w:r>
+              <w:rPr>
+                <w:rFonts w:ascii="Calibri" w:hAnsi="Calibri" w:eastAsia="Calibri"/>
+                <w:b/>
+                <w:color w:val="FFFFFF"/>
+                <w:sz w:val="16"/>
+              </w:rPr>
+              <w:t>Supplier</w:t>
+            </w:r>
+          </w:p>
+        </w:tc>
+        <w:tc>
+          <w:tcPr>
+            <w:tcW w:type="dxa" w:w="1158"/>
+            <w:shd w:val="clear" w:color="auto" w:fill="1F4E79"/>
+            <w:tcMar>
+              <w:top w:w="60" w:type="dxa"/>
+              <w:left w:w="60" w:type="dxa"/>
+              <w:bottom w:w="60" w:type="dxa"/>
+              <w:right w:w="60" w:type="dxa"/>
+            </w:tcMar>
+          </w:tcPr>
+          <w:p>
+            <w:pPr>
+              <w:spacing w:before="20" w:after="20"/>
+            </w:pPr>
+            <w:r/>
+            <w:r>
+              <w:rPr>
+                <w:rFonts w:ascii="Calibri" w:hAnsi="Calibri" w:eastAsia="Calibri"/>
+                <w:b/>
+                <w:color w:val="FFFFFF"/>
+                <w:sz w:val="16"/>
+              </w:rPr>
+              <w:t>Clearing doc</w:t>
+            </w:r>
+          </w:p>
+        </w:tc>
+        <w:tc>
+          <w:tcPr>
+            <w:tcW w:type="dxa" w:w="1158"/>
+            <w:shd w:val="clear" w:color="auto" w:fill="1F4E79"/>
+            <w:tcMar>
+              <w:top w:w="60" w:type="dxa"/>
+              <w:left w:w="60" w:type="dxa"/>
+              <w:bottom w:w="60" w:type="dxa"/>
+              <w:right w:w="60" w:type="dxa"/>
+            </w:tcMar>
+          </w:tcPr>
+          <w:p>
+            <w:pPr>
+              <w:spacing w:before="20" w:after="20"/>
+            </w:pPr>
+            <w:r/>
+            <w:r>
+              <w:rPr>
+                <w:rFonts w:ascii="Calibri" w:hAnsi="Calibri" w:eastAsia="Calibri"/>
+                <w:b/>
+                <w:color w:val="FFFFFF"/>
+                <w:sz w:val="16"/>
+              </w:rPr>
+              <w:t>Clearing date</w:t>
+            </w:r>
+          </w:p>
+        </w:tc>
+      </w:tr>
+      <w:tr>
+        <w:trPr>
+          <w:cantSplit/>
+        </w:trPr>
+        <w:tc>
+          <w:tcPr>
+            <w:tcW w:type="dxa" w:w="1158"/>
+            <w:shd w:val="clear" w:color="auto" w:fill="FFFFFF"/>
+            <w:tcMar>
+              <w:top w:w="60" w:type="dxa"/>
+              <w:left w:w="60" w:type="dxa"/>
+              <w:bottom w:w="60" w:type="dxa"/>
+              <w:right w:w="60" w:type="dxa"/>
+            </w:tcMar>
+          </w:tcPr>
+          <w:p>
+            <w:pPr>
+              <w:spacing w:before="20" w:after="20"/>
+            </w:pPr>
+            <w:r/>
+            <w:r>
+              <w:rPr>
+                <w:rFonts w:ascii="Calibri" w:hAnsi="Calibri" w:eastAsia="Calibri"/>
+                <w:b w:val="0"/>
+                <w:color w:val="1A1A1A"/>
+                <w:sz w:val="16"/>
+              </w:rPr>
+              <w:t>1500000002</w:t>
+            </w:r>
+          </w:p>
+        </w:tc>
+        <w:tc>
+          <w:tcPr>
+            <w:tcW w:type="dxa" w:w="1158"/>
+            <w:shd w:val="clear" w:color="auto" w:fill="FFFFFF"/>
+            <w:tcMar>
+              <w:top w:w="60" w:type="dxa"/>
+              <w:left w:w="60" w:type="dxa"/>
+              <w:bottom w:w="60" w:type="dxa"/>
+              <w:right w:w="60" w:type="dxa"/>
+            </w:tcMar>
+          </w:tcPr>
+          <w:p>
+            <w:pPr>
+              <w:spacing w:before="20" w:after="20"/>
+            </w:pPr>
+            <w:r/>
+            <w:r>
+              <w:rPr>
+                <w:rFonts w:ascii="Calibri" w:hAnsi="Calibri" w:eastAsia="Calibri"/>
+                <w:b w:val="0"/>
+                <w:color w:val="1A1A1A"/>
+                <w:sz w:val="16"/>
+              </w:rPr>
+              <w:t>KZ</w:t>
+            </w:r>
+          </w:p>
+        </w:tc>
+        <w:tc>
+          <w:tcPr>
+            <w:tcW w:type="dxa" w:w="1158"/>
+            <w:shd w:val="clear" w:color="auto" w:fill="FFFFFF"/>
+            <w:tcMar>
+              <w:top w:w="60" w:type="dxa"/>
+              <w:left w:w="60" w:type="dxa"/>
+              <w:bottom w:w="60" w:type="dxa"/>
+              <w:right w:w="60" w:type="dxa"/>
+            </w:tcMar>
+          </w:tcPr>
+          <w:p>
+            <w:pPr>
+              <w:spacing w:before="20" w:after="20"/>
+            </w:pPr>
+            <w:r/>
+            <w:r>
+              <w:rPr>
+                <w:rFonts w:ascii="Calibri" w:hAnsi="Calibri" w:eastAsia="Calibri"/>
+                <w:b w:val="0"/>
+                <w:color w:val="1A1A1A"/>
+                <w:sz w:val="16"/>
+              </w:rPr>
+              <w:t>000001</w:t>
+            </w:r>
+          </w:p>
+        </w:tc>
+        <w:tc>
+          <w:tcPr>
+            <w:tcW w:type="dxa" w:w="1158"/>
+            <w:shd w:val="clear" w:color="auto" w:fill="FFFFFF"/>
+            <w:tcMar>
+              <w:top w:w="60" w:type="dxa"/>
+              <w:left w:w="60" w:type="dxa"/>
+              <w:bottom w:w="60" w:type="dxa"/>
+              <w:right w:w="60" w:type="dxa"/>
+            </w:tcMar>
+          </w:tcPr>
+          <w:p>
+            <w:pPr>
+              <w:spacing w:before="20" w:after="20"/>
+            </w:pPr>
+            <w:r/>
+            <w:r>
+              <w:rPr>
+                <w:rFonts w:ascii="Calibri" w:hAnsi="Calibri" w:eastAsia="Calibri"/>
+                <w:b w:val="0"/>
+                <w:color w:val="1A1A1A"/>
+                <w:sz w:val="16"/>
+              </w:rPr>
+              <w:t>0011002000</w:t>
+            </w:r>
+          </w:p>
+        </w:tc>
+        <w:tc>
+          <w:tcPr>
+            <w:tcW w:type="dxa" w:w="1158"/>
+            <w:shd w:val="clear" w:color="auto" w:fill="FFFFFF"/>
+            <w:tcMar>
+              <w:top w:w="60" w:type="dxa"/>
+              <w:left w:w="60" w:type="dxa"/>
+              <w:bottom w:w="60" w:type="dxa"/>
+              <w:right w:w="60" w:type="dxa"/>
+            </w:tcMar>
+          </w:tcPr>
+          <w:p>
+            <w:pPr>
+              <w:spacing w:before="20" w:after="20"/>
+            </w:pPr>
+            <w:r/>
+            <w:r>
+              <w:rPr>
+                <w:rFonts w:ascii="Calibri" w:hAnsi="Calibri" w:eastAsia="Calibri"/>
+                <w:b w:val="0"/>
+                <w:color w:val="1A1A1A"/>
+                <w:sz w:val="16"/>
+              </w:rPr>
+              <w:t>H</w:t>
+            </w:r>
+          </w:p>
+        </w:tc>
+        <w:tc>
+          <w:tcPr>
+            <w:tcW w:type="dxa" w:w="1158"/>
+            <w:shd w:val="clear" w:color="auto" w:fill="FFFFFF"/>
+            <w:tcMar>
+              <w:top w:w="60" w:type="dxa"/>
+              <w:left w:w="60" w:type="dxa"/>
+              <w:bottom w:w="60" w:type="dxa"/>
+              <w:right w:w="60" w:type="dxa"/>
+            </w:tcMar>
+          </w:tcPr>
+          <w:p>
+            <w:pPr>
+              <w:spacing w:before="20" w:after="20"/>
+            </w:pPr>
+            <w:r/>
+            <w:r>
+              <w:rPr>
+                <w:rFonts w:ascii="Calibri" w:hAnsi="Calibri" w:eastAsia="Calibri"/>
+                <w:b w:val="0"/>
+                <w:color w:val="1A1A1A"/>
+                <w:sz w:val="16"/>
+              </w:rPr>
+              <w:t>-221.00</w:t>
+            </w:r>
+          </w:p>
+        </w:tc>
+        <w:tc>
+          <w:tcPr>
+            <w:tcW w:type="dxa" w:w="1158"/>
+            <w:shd w:val="clear" w:color="auto" w:fill="FFFFFF"/>
+            <w:tcMar>
+              <w:top w:w="60" w:type="dxa"/>
+              <w:left w:w="60" w:type="dxa"/>
+              <w:bottom w:w="60" w:type="dxa"/>
+              <w:right w:w="60" w:type="dxa"/>
+            </w:tcMar>
+          </w:tcPr>
+          <w:p>
+            <w:pPr>
+              <w:spacing w:before="20" w:after="20"/>
+            </w:pPr>
+            <w:r/>
+            <w:r>
+              <w:rPr>
+                <w:rFonts w:ascii="Calibri" w:hAnsi="Calibri" w:eastAsia="Calibri"/>
+                <w:b w:val="0"/>
+                <w:color w:val="1A1A1A"/>
+                <w:sz w:val="16"/>
+              </w:rPr>
+            </w:r>
+          </w:p>
+        </w:tc>
+        <w:tc>
+          <w:tcPr>
+            <w:tcW w:type="dxa" w:w="1158"/>
+            <w:shd w:val="clear" w:color="auto" w:fill="FFFFFF"/>
+            <w:tcMar>
+              <w:top w:w="60" w:type="dxa"/>
+              <w:left w:w="60" w:type="dxa"/>
+              <w:bottom w:w="60" w:type="dxa"/>
+              <w:right w:w="60" w:type="dxa"/>
+            </w:tcMar>
+          </w:tcPr>
+          <w:p>
+            <w:pPr>
+              <w:spacing w:before="20" w:after="20"/>
+            </w:pPr>
+            <w:r/>
+            <w:r>
+              <w:rPr>
+                <w:rFonts w:ascii="Calibri" w:hAnsi="Calibri" w:eastAsia="Calibri"/>
+                <w:b w:val="0"/>
+                <w:color w:val="1A1A1A"/>
+                <w:sz w:val="16"/>
+              </w:rPr>
+            </w:r>
+          </w:p>
+        </w:tc>
+        <w:tc>
+          <w:tcPr>
+            <w:tcW w:type="dxa" w:w="1158"/>
+            <w:shd w:val="clear" w:color="auto" w:fill="FFFFFF"/>
+            <w:tcMar>
+              <w:top w:w="60" w:type="dxa"/>
+              <w:left w:w="60" w:type="dxa"/>
+              <w:bottom w:w="60" w:type="dxa"/>
+              <w:right w:w="60" w:type="dxa"/>
+            </w:tcMar>
+          </w:tcPr>
+          <w:p>
+            <w:pPr>
+              <w:spacing w:before="20" w:after="20"/>
+            </w:pPr>
+            <w:r/>
+            <w:r>
+              <w:rPr>
+                <w:rFonts w:ascii="Calibri" w:hAnsi="Calibri" w:eastAsia="Calibri"/>
+                <w:b w:val="0"/>
+                <w:color w:val="1A1A1A"/>
+                <w:sz w:val="16"/>
+              </w:rPr>
+            </w:r>
+          </w:p>
+        </w:tc>
+      </w:tr>
+      <w:tr>
+        <w:trPr>
+          <w:cantSplit/>
+        </w:trPr>
+        <w:tc>
+          <w:tcPr>
+            <w:tcW w:type="dxa" w:w="1158"/>
+            <w:shd w:val="clear" w:color="auto" w:fill="F3F6F9"/>
+            <w:tcMar>
+              <w:top w:w="60" w:type="dxa"/>
+              <w:left w:w="60" w:type="dxa"/>
+              <w:bottom w:w="60" w:type="dxa"/>
+              <w:right w:w="60" w:type="dxa"/>
+            </w:tcMar>
+          </w:tcPr>
+          <w:p>
+            <w:pPr>
+              <w:spacing w:before="20" w:after="20"/>
+            </w:pPr>
+            <w:r/>
+            <w:r>
+              <w:rPr>
+                <w:rFonts w:ascii="Calibri" w:hAnsi="Calibri" w:eastAsia="Calibri"/>
+                <w:b w:val="0"/>
+                <w:color w:val="1A1A1A"/>
+                <w:sz w:val="16"/>
+              </w:rPr>
+              <w:t>1500000002</w:t>
+            </w:r>
+          </w:p>
+        </w:tc>
+        <w:tc>
+          <w:tcPr>
+            <w:tcW w:type="dxa" w:w="1158"/>
+            <w:shd w:val="clear" w:color="auto" w:fill="F3F6F9"/>
+            <w:tcMar>
+              <w:top w:w="60" w:type="dxa"/>
+              <w:left w:w="60" w:type="dxa"/>
+              <w:bottom w:w="60" w:type="dxa"/>
+              <w:right w:w="60" w:type="dxa"/>
+            </w:tcMar>
+          </w:tcPr>
+          <w:p>
+            <w:pPr>
+              <w:spacing w:before="20" w:after="20"/>
+            </w:pPr>
+            <w:r/>
+            <w:r>
+              <w:rPr>
+                <w:rFonts w:ascii="Calibri" w:hAnsi="Calibri" w:eastAsia="Calibri"/>
+                <w:b w:val="0"/>
+                <w:color w:val="1A1A1A"/>
+                <w:sz w:val="16"/>
+              </w:rPr>
+              <w:t>KZ</w:t>
+            </w:r>
+          </w:p>
+        </w:tc>
+        <w:tc>
+          <w:tcPr>
+            <w:tcW w:type="dxa" w:w="1158"/>
+            <w:shd w:val="clear" w:color="auto" w:fill="F3F6F9"/>
+            <w:tcMar>
+              <w:top w:w="60" w:type="dxa"/>
+              <w:left w:w="60" w:type="dxa"/>
+              <w:bottom w:w="60" w:type="dxa"/>
+              <w:right w:w="60" w:type="dxa"/>
+            </w:tcMar>
+          </w:tcPr>
+          <w:p>
+            <w:pPr>
+              <w:spacing w:before="20" w:after="20"/>
+            </w:pPr>
+            <w:r/>
+            <w:r>
+              <w:rPr>
+                <w:rFonts w:ascii="Calibri" w:hAnsi="Calibri" w:eastAsia="Calibri"/>
+                <w:b w:val="0"/>
+                <w:color w:val="1A1A1A"/>
+                <w:sz w:val="16"/>
+              </w:rPr>
+              <w:t>000002</w:t>
+            </w:r>
+          </w:p>
+        </w:tc>
+        <w:tc>
+          <w:tcPr>
+            <w:tcW w:type="dxa" w:w="1158"/>
+            <w:shd w:val="clear" w:color="auto" w:fill="F3F6F9"/>
+            <w:tcMar>
+              <w:top w:w="60" w:type="dxa"/>
+              <w:left w:w="60" w:type="dxa"/>
+              <w:bottom w:w="60" w:type="dxa"/>
+              <w:right w:w="60" w:type="dxa"/>
+            </w:tcMar>
+          </w:tcPr>
+          <w:p>
+            <w:pPr>
+              <w:spacing w:before="20" w:after="20"/>
+            </w:pPr>
+            <w:r/>
+            <w:r>
+              <w:rPr>
+                <w:rFonts w:ascii="Calibri" w:hAnsi="Calibri" w:eastAsia="Calibri"/>
+                <w:b w:val="0"/>
+                <w:color w:val="1A1A1A"/>
+                <w:sz w:val="16"/>
+              </w:rPr>
+              <w:t>0021100000</w:t>
+            </w:r>
+          </w:p>
+        </w:tc>
+        <w:tc>
+          <w:tcPr>
+            <w:tcW w:type="dxa" w:w="1158"/>
+            <w:shd w:val="clear" w:color="auto" w:fill="F3F6F9"/>
+            <w:tcMar>
+              <w:top w:w="60" w:type="dxa"/>
+              <w:left w:w="60" w:type="dxa"/>
+              <w:bottom w:w="60" w:type="dxa"/>
+              <w:right w:w="60" w:type="dxa"/>
+            </w:tcMar>
+          </w:tcPr>
+          <w:p>
+            <w:pPr>
+              <w:spacing w:before="20" w:after="20"/>
+            </w:pPr>
+            <w:r/>
+            <w:r>
+              <w:rPr>
+                <w:rFonts w:ascii="Calibri" w:hAnsi="Calibri" w:eastAsia="Calibri"/>
+                <w:b w:val="0"/>
+                <w:color w:val="1A1A1A"/>
+                <w:sz w:val="16"/>
+              </w:rPr>
+              <w:t>S</w:t>
+            </w:r>
+          </w:p>
+        </w:tc>
+        <w:tc>
+          <w:tcPr>
+            <w:tcW w:type="dxa" w:w="1158"/>
+            <w:shd w:val="clear" w:color="auto" w:fill="F3F6F9"/>
+            <w:tcMar>
+              <w:top w:w="60" w:type="dxa"/>
+              <w:left w:w="60" w:type="dxa"/>
+              <w:bottom w:w="60" w:type="dxa"/>
+              <w:right w:w="60" w:type="dxa"/>
+            </w:tcMar>
+          </w:tcPr>
+          <w:p>
+            <w:pPr>
+              <w:spacing w:before="20" w:after="20"/>
+            </w:pPr>
+            <w:r/>
+            <w:r>
+              <w:rPr>
+                <w:rFonts w:ascii="Calibri" w:hAnsi="Calibri" w:eastAsia="Calibri"/>
+                <w:b w:val="0"/>
+                <w:color w:val="1A1A1A"/>
+                <w:sz w:val="16"/>
+              </w:rPr>
+              <w:t>221.00</w:t>
+            </w:r>
+          </w:p>
+        </w:tc>
+        <w:tc>
+          <w:tcPr>
+            <w:tcW w:type="dxa" w:w="1158"/>
+            <w:shd w:val="clear" w:color="auto" w:fill="F3F6F9"/>
+            <w:tcMar>
+              <w:top w:w="60" w:type="dxa"/>
+              <w:left w:w="60" w:type="dxa"/>
+              <w:bottom w:w="60" w:type="dxa"/>
+              <w:right w:w="60" w:type="dxa"/>
+            </w:tcMar>
+          </w:tcPr>
+          <w:p>
+            <w:pPr>
+              <w:spacing w:before="20" w:after="20"/>
+            </w:pPr>
+            <w:r/>
+            <w:r>
+              <w:rPr>
+                <w:rFonts w:ascii="Calibri" w:hAnsi="Calibri" w:eastAsia="Calibri"/>
+                <w:b w:val="0"/>
+                <w:color w:val="1A1A1A"/>
+                <w:sz w:val="16"/>
+              </w:rPr>
+              <w:t>0001000579</w:t>
+            </w:r>
+          </w:p>
+        </w:tc>
+        <w:tc>
+          <w:tcPr>
+            <w:tcW w:type="dxa" w:w="1158"/>
+            <w:shd w:val="clear" w:color="auto" w:fill="F3F6F9"/>
+            <w:tcMar>
+              <w:top w:w="60" w:type="dxa"/>
+              <w:left w:w="60" w:type="dxa"/>
+              <w:bottom w:w="60" w:type="dxa"/>
+              <w:right w:w="60" w:type="dxa"/>
+            </w:tcMar>
+          </w:tcPr>
+          <w:p>
+            <w:pPr>
+              <w:spacing w:before="20" w:after="20"/>
+            </w:pPr>
+            <w:r/>
+            <w:r>
+              <w:rPr>
+                <w:rFonts w:ascii="Calibri" w:hAnsi="Calibri" w:eastAsia="Calibri"/>
+                <w:b w:val="0"/>
+                <w:color w:val="1A1A1A"/>
+                <w:sz w:val="16"/>
+              </w:rPr>
+              <w:t>1500000002</w:t>
+            </w:r>
+          </w:p>
+        </w:tc>
+        <w:tc>
+          <w:tcPr>
+            <w:tcW w:type="dxa" w:w="1158"/>
+            <w:shd w:val="clear" w:color="auto" w:fill="F3F6F9"/>
+            <w:tcMar>
+              <w:top w:w="60" w:type="dxa"/>
+              <w:left w:w="60" w:type="dxa"/>
+              <w:bottom w:w="60" w:type="dxa"/>
+              <w:right w:w="60" w:type="dxa"/>
+            </w:tcMar>
+          </w:tcPr>
+          <w:p>
+            <w:pPr>
+              <w:spacing w:before="20" w:after="20"/>
+            </w:pPr>
+            <w:r/>
+            <w:r>
+              <w:rPr>
+                <w:rFonts w:ascii="Calibri" w:hAnsi="Calibri" w:eastAsia="Calibri"/>
+                <w:b w:val="0"/>
+                <w:color w:val="1A1A1A"/>
+                <w:sz w:val="16"/>
+              </w:rPr>
+              <w:t>20261013</w:t>
+            </w:r>
+          </w:p>
+        </w:tc>
+      </w:tr>
+      <w:tr>
+        <w:trPr>
+          <w:cantSplit/>
+        </w:trPr>
+        <w:tc>
+          <w:tcPr>
+            <w:tcW w:type="dxa" w:w="1158"/>
+            <w:shd w:val="clear" w:color="auto" w:fill="FFFFFF"/>
+            <w:tcMar>
+              <w:top w:w="60" w:type="dxa"/>
+              <w:left w:w="60" w:type="dxa"/>
+              <w:bottom w:w="60" w:type="dxa"/>
+              <w:right w:w="60" w:type="dxa"/>
+            </w:tcMar>
+          </w:tcPr>
+          <w:p>
+            <w:pPr>
+              <w:spacing w:before="20" w:after="20"/>
+            </w:pPr>
+            <w:r/>
+            <w:r>
+              <w:rPr>
+                <w:rFonts w:ascii="Calibri" w:hAnsi="Calibri" w:eastAsia="Calibri"/>
+                <w:b w:val="0"/>
+                <w:color w:val="1A1A1A"/>
+                <w:sz w:val="16"/>
+              </w:rPr>
+              <w:t>5100000003</w:t>
+            </w:r>
+          </w:p>
+        </w:tc>
+        <w:tc>
+          <w:tcPr>
+            <w:tcW w:type="dxa" w:w="1158"/>
+            <w:shd w:val="clear" w:color="auto" w:fill="FFFFFF"/>
+            <w:tcMar>
+              <w:top w:w="60" w:type="dxa"/>
+              <w:left w:w="60" w:type="dxa"/>
+              <w:bottom w:w="60" w:type="dxa"/>
+              <w:right w:w="60" w:type="dxa"/>
+            </w:tcMar>
+          </w:tcPr>
+          <w:p>
+            <w:pPr>
+              <w:spacing w:before="20" w:after="20"/>
+            </w:pPr>
+            <w:r/>
+            <w:r>
+              <w:rPr>
+                <w:rFonts w:ascii="Calibri" w:hAnsi="Calibri" w:eastAsia="Calibri"/>
+                <w:b w:val="0"/>
+                <w:color w:val="1A1A1A"/>
+                <w:sz w:val="16"/>
+              </w:rPr>
+              <w:t>RE</w:t>
+            </w:r>
+          </w:p>
+        </w:tc>
+        <w:tc>
+          <w:tcPr>
+            <w:tcW w:type="dxa" w:w="1158"/>
+            <w:shd w:val="clear" w:color="auto" w:fill="FFFFFF"/>
+            <w:tcMar>
+              <w:top w:w="60" w:type="dxa"/>
+              <w:left w:w="60" w:type="dxa"/>
+              <w:bottom w:w="60" w:type="dxa"/>
+              <w:right w:w="60" w:type="dxa"/>
+            </w:tcMar>
+          </w:tcPr>
+          <w:p>
+            <w:pPr>
+              <w:spacing w:before="20" w:after="20"/>
+            </w:pPr>
+            <w:r/>
+            <w:r>
+              <w:rPr>
+                <w:rFonts w:ascii="Calibri" w:hAnsi="Calibri" w:eastAsia="Calibri"/>
+                <w:b w:val="0"/>
+                <w:color w:val="1A1A1A"/>
+                <w:sz w:val="16"/>
+              </w:rPr>
+              <w:t>000001</w:t>
+            </w:r>
+          </w:p>
+        </w:tc>
+        <w:tc>
+          <w:tcPr>
+            <w:tcW w:type="dxa" w:w="1158"/>
+            <w:shd w:val="clear" w:color="auto" w:fill="FFFFFF"/>
+            <w:tcMar>
+              <w:top w:w="60" w:type="dxa"/>
+              <w:left w:w="60" w:type="dxa"/>
+              <w:bottom w:w="60" w:type="dxa"/>
+              <w:right w:w="60" w:type="dxa"/>
+            </w:tcMar>
+          </w:tcPr>
+          <w:p>
+            <w:pPr>
+              <w:spacing w:before="20" w:after="20"/>
+            </w:pPr>
+            <w:r/>
+            <w:r>
+              <w:rPr>
+                <w:rFonts w:ascii="Calibri" w:hAnsi="Calibri" w:eastAsia="Calibri"/>
+                <w:b w:val="0"/>
+                <w:color w:val="1A1A1A"/>
+                <w:sz w:val="16"/>
+              </w:rPr>
+              <w:t>0021100000</w:t>
+            </w:r>
+          </w:p>
+        </w:tc>
+        <w:tc>
+          <w:tcPr>
+            <w:tcW w:type="dxa" w:w="1158"/>
+            <w:shd w:val="clear" w:color="auto" w:fill="FFFFFF"/>
+            <w:tcMar>
+              <w:top w:w="60" w:type="dxa"/>
+              <w:left w:w="60" w:type="dxa"/>
+              <w:bottom w:w="60" w:type="dxa"/>
+              <w:right w:w="60" w:type="dxa"/>
+            </w:tcMar>
+          </w:tcPr>
+          <w:p>
+            <w:pPr>
+              <w:spacing w:before="20" w:after="20"/>
+            </w:pPr>
+            <w:r/>
+            <w:r>
+              <w:rPr>
+                <w:rFonts w:ascii="Calibri" w:hAnsi="Calibri" w:eastAsia="Calibri"/>
+                <w:b w:val="0"/>
+                <w:color w:val="1A1A1A"/>
+                <w:sz w:val="16"/>
+              </w:rPr>
+              <w:t>H</w:t>
+            </w:r>
+          </w:p>
+        </w:tc>
+        <w:tc>
+          <w:tcPr>
+            <w:tcW w:type="dxa" w:w="1158"/>
+            <w:shd w:val="clear" w:color="auto" w:fill="FFFFFF"/>
+            <w:tcMar>
+              <w:top w:w="60" w:type="dxa"/>
+              <w:left w:w="60" w:type="dxa"/>
+              <w:bottom w:w="60" w:type="dxa"/>
+              <w:right w:w="60" w:type="dxa"/>
+            </w:tcMar>
+          </w:tcPr>
+          <w:p>
+            <w:pPr>
+              <w:spacing w:before="20" w:after="20"/>
+            </w:pPr>
+            <w:r/>
+            <w:r>
+              <w:rPr>
+                <w:rFonts w:ascii="Calibri" w:hAnsi="Calibri" w:eastAsia="Calibri"/>
+                <w:b w:val="0"/>
+                <w:color w:val="1A1A1A"/>
+                <w:sz w:val="16"/>
+              </w:rPr>
+              <w:t>-221.00</w:t>
+            </w:r>
+          </w:p>
+        </w:tc>
+        <w:tc>
+          <w:tcPr>
+            <w:tcW w:type="dxa" w:w="1158"/>
+            <w:shd w:val="clear" w:color="auto" w:fill="FFFFFF"/>
+            <w:tcMar>
+              <w:top w:w="60" w:type="dxa"/>
+              <w:left w:w="60" w:type="dxa"/>
+              <w:bottom w:w="60" w:type="dxa"/>
+              <w:right w:w="60" w:type="dxa"/>
+            </w:tcMar>
+          </w:tcPr>
+          <w:p>
+            <w:pPr>
+              <w:spacing w:before="20" w:after="20"/>
+            </w:pPr>
+            <w:r/>
+            <w:r>
+              <w:rPr>
+                <w:rFonts w:ascii="Calibri" w:hAnsi="Calibri" w:eastAsia="Calibri"/>
+                <w:b w:val="0"/>
+                <w:color w:val="1A1A1A"/>
+                <w:sz w:val="16"/>
+              </w:rPr>
+              <w:t>0001000579</w:t>
+            </w:r>
+          </w:p>
+        </w:tc>
+        <w:tc>
+          <w:tcPr>
+            <w:tcW w:type="dxa" w:w="1158"/>
+            <w:shd w:val="clear" w:color="auto" w:fill="FFFFFF"/>
+            <w:tcMar>
+              <w:top w:w="60" w:type="dxa"/>
+              <w:left w:w="60" w:type="dxa"/>
+              <w:bottom w:w="60" w:type="dxa"/>
+              <w:right w:w="60" w:type="dxa"/>
+            </w:tcMar>
+          </w:tcPr>
+          <w:p>
+            <w:pPr>
+              <w:spacing w:before="20" w:after="20"/>
+            </w:pPr>
+            <w:r/>
+            <w:r>
+              <w:rPr>
+                <w:rFonts w:ascii="Calibri" w:hAnsi="Calibri" w:eastAsia="Calibri"/>
+                <w:b w:val="0"/>
+                <w:color w:val="1A1A1A"/>
+                <w:sz w:val="16"/>
+              </w:rPr>
+              <w:t>1500000002</w:t>
+            </w:r>
+          </w:p>
+        </w:tc>
+        <w:tc>
+          <w:tcPr>
+            <w:tcW w:type="dxa" w:w="1158"/>
+            <w:shd w:val="clear" w:color="auto" w:fill="FFFFFF"/>
+            <w:tcMar>
+              <w:top w:w="60" w:type="dxa"/>
+              <w:left w:w="60" w:type="dxa"/>
+              <w:bottom w:w="60" w:type="dxa"/>
+              <w:right w:w="60" w:type="dxa"/>
+            </w:tcMar>
+          </w:tcPr>
+          <w:p>
+            <w:pPr>
+              <w:spacing w:before="20" w:after="20"/>
+            </w:pPr>
+            <w:r/>
+            <w:r>
+              <w:rPr>
+                <w:rFonts w:ascii="Calibri" w:hAnsi="Calibri" w:eastAsia="Calibri"/>
+                <w:b w:val="0"/>
+                <w:color w:val="1A1A1A"/>
+                <w:sz w:val="16"/>
+              </w:rPr>
+              <w:t>20261013</w:t>
+            </w:r>
+          </w:p>
+        </w:tc>
+      </w:tr>
+    </w:tbl>
+    <w:p>
+      <w:pPr>
+        <w:spacing w:after="120"/>
+      </w:pPr>
     </w:p>
     <w:p>
       <w:pPr>
@@ -7580,7 +10334,7 @@
                 <w:color w:val="1A1A1A"/>
                 <w:sz w:val="16"/>
               </w:rPr>
-              <w:t>I_GLAccount</w:t>
+              <w:t>I_GLAccountLineItemRawData</w:t>
             </w:r>
           </w:p>
         </w:tc>
@@ -7588,6 +10342,65 @@
           <w:tcPr>
             <w:tcW w:type="dxa" w:w="5213"/>
             <w:shd w:val="clear" w:color="auto" w:fill="F3F6F9"/>
+            <w:tcMar>
+              <w:top w:w="60" w:type="dxa"/>
+              <w:left w:w="60" w:type="dxa"/>
+              <w:bottom w:w="60" w:type="dxa"/>
+              <w:right w:w="60" w:type="dxa"/>
+            </w:tcMar>
+          </w:tcPr>
+          <w:p>
+            <w:pPr>
+              <w:spacing w:before="20" w:after="20"/>
+            </w:pPr>
+            <w:r/>
+            <w:r>
+              <w:rPr>
+                <w:rFonts w:ascii="Calibri" w:hAnsi="Calibri" w:eastAsia="Calibri"/>
+                <w:b w:val="0"/>
+                <w:color w:val="1A1A1A"/>
+                <w:sz w:val="16"/>
+              </w:rPr>
+              <w:t>CompanyCode eq '1710' and SourceLedger eq '0L' and (AccountingDocument eq '5000000004' or AccountingDocument eq '5100000003' or AccountingDocument eq '1500000002')</w:t>
+            </w:r>
+          </w:p>
+        </w:tc>
+      </w:tr>
+      <w:tr>
+        <w:trPr>
+          <w:cantSplit/>
+        </w:trPr>
+        <w:tc>
+          <w:tcPr>
+            <w:tcW w:type="dxa" w:w="5213"/>
+            <w:shd w:val="clear" w:color="auto" w:fill="FFFFFF"/>
+            <w:tcMar>
+              <w:top w:w="60" w:type="dxa"/>
+              <w:left w:w="60" w:type="dxa"/>
+              <w:bottom w:w="60" w:type="dxa"/>
+              <w:right w:w="60" w:type="dxa"/>
+            </w:tcMar>
+          </w:tcPr>
+          <w:p>
+            <w:pPr>
+              <w:spacing w:before="20" w:after="20"/>
+            </w:pPr>
+            <w:r/>
+            <w:r>
+              <w:rPr>
+                <w:rFonts w:ascii="Calibri" w:hAnsi="Calibri" w:eastAsia="Calibri"/>
+                <w:b w:val="0"/>
+                <w:color w:val="1A1A1A"/>
+                <w:sz w:val="16"/>
+              </w:rPr>
+              <w:t>I_GLAccount</w:t>
+            </w:r>
+          </w:p>
+        </w:tc>
+        <w:tc>
+          <w:tcPr>
+            <w:tcW w:type="dxa" w:w="5213"/>
+            <w:shd w:val="clear" w:color="auto" w:fill="FFFFFF"/>
             <w:tcMar>
               <w:top w:w="60" w:type="dxa"/>
               <w:left w:w="60" w:type="dxa"/>

</xml_diff>